<commit_message>
Avances documentación (Diagramas, requremientos y arquitectura)
</commit_message>
<xml_diff>
--- a/mi-proyecto/docs/MONOGRAFIA.docx
+++ b/mi-proyecto/docs/MONOGRAFIA.docx
@@ -3506,7 +3506,7 @@
         </w:rPr>
         <w:fldChar w:fldCharType="separate"/>
       </w:r>
-      <w:hyperlink w:anchor="_Toc240230357" w:history="1">
+      <w:hyperlink w:anchor="_Toc241394740" w:history="1">
         <w:r>
           <w:rPr>
             <w:rStyle w:val="Hipervnculo"/>
@@ -3533,7 +3533,7 @@
             <w:noProof/>
             <w:webHidden/>
           </w:rPr>
-          <w:instrText xml:space="preserve"> PAGEREF _Toc240230357 \h </w:instrText>
+          <w:instrText xml:space="preserve"> PAGEREF _Toc241394740 \h </w:instrText>
         </w:r>
         <w:r>
           <w:rPr>
@@ -3581,7 +3581,7 @@
           <w14:ligatures w14:val="standardContextual"/>
         </w:rPr>
       </w:pPr>
-      <w:hyperlink w:anchor="_Toc240230358" w:history="1">
+      <w:hyperlink w:anchor="_Toc241394741" w:history="1">
         <w:r>
           <w:rPr>
             <w:rStyle w:val="Hipervnculo"/>
@@ -3608,7 +3608,7 @@
             <w:noProof/>
             <w:webHidden/>
           </w:rPr>
-          <w:instrText xml:space="preserve"> PAGEREF _Toc240230358 \h </w:instrText>
+          <w:instrText xml:space="preserve"> PAGEREF _Toc241394741 \h </w:instrText>
         </w:r>
         <w:r>
           <w:rPr>
@@ -3656,7 +3656,7 @@
           <w14:ligatures w14:val="standardContextual"/>
         </w:rPr>
       </w:pPr>
-      <w:hyperlink w:anchor="_Toc240230359" w:history="1">
+      <w:hyperlink w:anchor="_Toc241394742" w:history="1">
         <w:r>
           <w:rPr>
             <w:rStyle w:val="Hipervnculo"/>
@@ -3683,7 +3683,7 @@
             <w:noProof/>
             <w:webHidden/>
           </w:rPr>
-          <w:instrText xml:space="preserve"> PAGEREF _Toc240230359 \h </w:instrText>
+          <w:instrText xml:space="preserve"> PAGEREF _Toc241394742 \h </w:instrText>
         </w:r>
         <w:r>
           <w:rPr>
@@ -3731,7 +3731,7 @@
           <w14:ligatures w14:val="standardContextual"/>
         </w:rPr>
       </w:pPr>
-      <w:hyperlink w:anchor="_Toc240230360" w:history="1">
+      <w:hyperlink w:anchor="_Toc241394743" w:history="1">
         <w:r>
           <w:rPr>
             <w:rStyle w:val="Hipervnculo"/>
@@ -3758,7 +3758,7 @@
             <w:noProof/>
             <w:webHidden/>
           </w:rPr>
-          <w:instrText xml:space="preserve"> PAGEREF _Toc240230360 \h </w:instrText>
+          <w:instrText xml:space="preserve"> PAGEREF _Toc241394743 \h </w:instrText>
         </w:r>
         <w:r>
           <w:rPr>
@@ -3806,7 +3806,7 @@
           <w14:ligatures w14:val="standardContextual"/>
         </w:rPr>
       </w:pPr>
-      <w:hyperlink w:anchor="_Toc240230361" w:history="1">
+      <w:hyperlink w:anchor="_Toc241394744" w:history="1">
         <w:r>
           <w:rPr>
             <w:rStyle w:val="Hipervnculo"/>
@@ -3833,7 +3833,7 @@
             <w:noProof/>
             <w:webHidden/>
           </w:rPr>
-          <w:instrText xml:space="preserve"> PAGEREF _Toc240230361 \h </w:instrText>
+          <w:instrText xml:space="preserve"> PAGEREF _Toc241394744 \h </w:instrText>
         </w:r>
         <w:r>
           <w:rPr>
@@ -3881,7 +3881,7 @@
           <w14:ligatures w14:val="standardContextual"/>
         </w:rPr>
       </w:pPr>
-      <w:hyperlink w:anchor="_Toc240230362" w:history="1">
+      <w:hyperlink w:anchor="_Toc241394745" w:history="1">
         <w:r>
           <w:rPr>
             <w:rStyle w:val="Hipervnculo"/>
@@ -3908,7 +3908,7 @@
             <w:noProof/>
             <w:webHidden/>
           </w:rPr>
-          <w:instrText xml:space="preserve"> PAGEREF _Toc240230362 \h </w:instrText>
+          <w:instrText xml:space="preserve"> PAGEREF _Toc241394745 \h </w:instrText>
         </w:r>
         <w:r>
           <w:rPr>
@@ -3956,7 +3956,7 @@
           <w14:ligatures w14:val="standardContextual"/>
         </w:rPr>
       </w:pPr>
-      <w:hyperlink w:anchor="_Toc240230363" w:history="1">
+      <w:hyperlink w:anchor="_Toc241394746" w:history="1">
         <w:r>
           <w:rPr>
             <w:rStyle w:val="Hipervnculo"/>
@@ -3983,7 +3983,7 @@
             <w:noProof/>
             <w:webHidden/>
           </w:rPr>
-          <w:instrText xml:space="preserve"> PAGEREF _Toc240230363 \h </w:instrText>
+          <w:instrText xml:space="preserve"> PAGEREF _Toc241394746 \h </w:instrText>
         </w:r>
         <w:r>
           <w:rPr>
@@ -4031,7 +4031,7 @@
           <w14:ligatures w14:val="standardContextual"/>
         </w:rPr>
       </w:pPr>
-      <w:hyperlink w:anchor="_Toc240230364" w:history="1">
+      <w:hyperlink w:anchor="_Toc241394747" w:history="1">
         <w:r>
           <w:rPr>
             <w:rStyle w:val="Hipervnculo"/>
@@ -4058,7 +4058,7 @@
             <w:noProof/>
             <w:webHidden/>
           </w:rPr>
-          <w:instrText xml:space="preserve"> PAGEREF _Toc240230364 \h </w:instrText>
+          <w:instrText xml:space="preserve"> PAGEREF _Toc241394747 \h </w:instrText>
         </w:r>
         <w:r>
           <w:rPr>
@@ -4106,7 +4106,7 @@
           <w14:ligatures w14:val="standardContextual"/>
         </w:rPr>
       </w:pPr>
-      <w:hyperlink w:anchor="_Toc240230365" w:history="1">
+      <w:hyperlink w:anchor="_Toc241394748" w:history="1">
         <w:r>
           <w:rPr>
             <w:rStyle w:val="Hipervnculo"/>
@@ -4133,7 +4133,7 @@
             <w:noProof/>
             <w:webHidden/>
           </w:rPr>
-          <w:instrText xml:space="preserve"> PAGEREF _Toc240230365 \h </w:instrText>
+          <w:instrText xml:space="preserve"> PAGEREF _Toc241394748 \h </w:instrText>
         </w:r>
         <w:r>
           <w:rPr>
@@ -4181,7 +4181,7 @@
           <w14:ligatures w14:val="standardContextual"/>
         </w:rPr>
       </w:pPr>
-      <w:hyperlink w:anchor="_Toc240230366" w:history="1">
+      <w:hyperlink w:anchor="_Toc241394749" w:history="1">
         <w:r>
           <w:rPr>
             <w:rStyle w:val="Hipervnculo"/>
@@ -4208,7 +4208,7 @@
             <w:noProof/>
             <w:webHidden/>
           </w:rPr>
-          <w:instrText xml:space="preserve"> PAGEREF _Toc240230366 \h </w:instrText>
+          <w:instrText xml:space="preserve"> PAGEREF _Toc241394749 \h </w:instrText>
         </w:r>
         <w:r>
           <w:rPr>
@@ -4256,7 +4256,7 @@
           <w14:ligatures w14:val="standardContextual"/>
         </w:rPr>
       </w:pPr>
-      <w:hyperlink w:anchor="_Toc240230367" w:history="1">
+      <w:hyperlink w:anchor="_Toc241394750" w:history="1">
         <w:r>
           <w:rPr>
             <w:rStyle w:val="Hipervnculo"/>
@@ -4283,7 +4283,7 @@
             <w:noProof/>
             <w:webHidden/>
           </w:rPr>
-          <w:instrText xml:space="preserve"> PAGEREF _Toc240230367 \h </w:instrText>
+          <w:instrText xml:space="preserve"> PAGEREF _Toc241394750 \h </w:instrText>
         </w:r>
         <w:r>
           <w:rPr>
@@ -4331,7 +4331,7 @@
           <w14:ligatures w14:val="standardContextual"/>
         </w:rPr>
       </w:pPr>
-      <w:hyperlink w:anchor="_Toc240230368" w:history="1">
+      <w:hyperlink w:anchor="_Toc241394751" w:history="1">
         <w:r>
           <w:rPr>
             <w:rStyle w:val="Hipervnculo"/>
@@ -4358,7 +4358,7 @@
             <w:noProof/>
             <w:webHidden/>
           </w:rPr>
-          <w:instrText xml:space="preserve"> PAGEREF _Toc240230368 \h </w:instrText>
+          <w:instrText xml:space="preserve"> PAGEREF _Toc241394751 \h </w:instrText>
         </w:r>
         <w:r>
           <w:rPr>
@@ -4406,7 +4406,7 @@
           <w14:ligatures w14:val="standardContextual"/>
         </w:rPr>
       </w:pPr>
-      <w:hyperlink w:anchor="_Toc240230369" w:history="1">
+      <w:hyperlink w:anchor="_Toc241394752" w:history="1">
         <w:r>
           <w:rPr>
             <w:rStyle w:val="Hipervnculo"/>
@@ -4433,7 +4433,7 @@
             <w:noProof/>
             <w:webHidden/>
           </w:rPr>
-          <w:instrText xml:space="preserve"> PAGEREF _Toc240230369 \h </w:instrText>
+          <w:instrText xml:space="preserve"> PAGEREF _Toc241394752 \h </w:instrText>
         </w:r>
         <w:r>
           <w:rPr>
@@ -4481,7 +4481,7 @@
           <w14:ligatures w14:val="standardContextual"/>
         </w:rPr>
       </w:pPr>
-      <w:hyperlink w:anchor="_Toc240230370" w:history="1">
+      <w:hyperlink w:anchor="_Toc241394753" w:history="1">
         <w:r>
           <w:rPr>
             <w:rStyle w:val="Hipervnculo"/>
@@ -4508,7 +4508,7 @@
             <w:noProof/>
             <w:webHidden/>
           </w:rPr>
-          <w:instrText xml:space="preserve"> PAGEREF _Toc240230370 \h </w:instrText>
+          <w:instrText xml:space="preserve"> PAGEREF _Toc241394753 \h </w:instrText>
         </w:r>
         <w:r>
           <w:rPr>
@@ -4541,211 +4541,74 @@
     </w:p>
     <w:p>
       <w:pPr>
-        <w:spacing w:line="240" w:lineRule="auto"/>
-        <w:ind w:firstLine="0"/>
-        <w:rPr>
-          <w:b/>
-          <w:bCs/>
-        </w:rPr>
-      </w:pPr>
-      <w:r>
-        <w:rPr>
-          <w:caps/>
-          <w:sz w:val="20"/>
-          <w:szCs w:val="20"/>
-        </w:rPr>
-        <w:fldChar w:fldCharType="end"/>
-      </w:r>
-    </w:p>
-    <w:p>
-      <w:pPr>
-        <w:spacing w:line="240" w:lineRule="auto"/>
-        <w:ind w:firstLine="0"/>
-        <w:jc w:val="center"/>
-        <w:rPr>
-          <w:b/>
-          <w:bCs/>
-        </w:rPr>
-      </w:pPr>
-    </w:p>
-    <w:p>
-      <w:pPr>
-        <w:spacing w:line="240" w:lineRule="auto"/>
-        <w:ind w:firstLine="0"/>
-        <w:jc w:val="left"/>
-        <w:rPr>
-          <w:b/>
-          <w:bCs/>
-        </w:rPr>
-      </w:pPr>
-      <w:r>
-        <w:rPr>
-          <w:b/>
-          <w:bCs/>
-        </w:rPr>
-        <w:br w:type="page"/>
-      </w:r>
-    </w:p>
-    <w:p>
-      <w:pPr>
-        <w:spacing w:line="240" w:lineRule="auto"/>
-        <w:ind w:firstLine="0"/>
-        <w:jc w:val="center"/>
-        <w:rPr>
-          <w:b/>
-          <w:bCs/>
-        </w:rPr>
-      </w:pPr>
-    </w:p>
-    <w:p>
-      <w:pPr>
-        <w:spacing w:line="240" w:lineRule="auto"/>
-        <w:ind w:firstLine="0"/>
-        <w:jc w:val="center"/>
-        <w:rPr>
-          <w:b/>
-          <w:bCs/>
-        </w:rPr>
-      </w:pPr>
-    </w:p>
-    <w:p>
-      <w:pPr>
-        <w:spacing w:line="240" w:lineRule="auto"/>
-        <w:ind w:firstLine="0"/>
-        <w:jc w:val="center"/>
-        <w:rPr>
-          <w:b/>
-          <w:bCs/>
-        </w:rPr>
-      </w:pPr>
-      <w:r>
-        <w:rPr>
-          <w:b/>
-          <w:bCs/>
-        </w:rPr>
-        <w:t>Índice de Figuras</w:t>
-      </w:r>
-    </w:p>
-    <w:p>
-      <w:pPr>
         <w:pStyle w:val="TDC1"/>
         <w:tabs>
           <w:tab w:val="right" w:leader="dot" w:pos="9316"/>
         </w:tabs>
         <w:rPr>
-          <w:rFonts w:ascii="Times New Roman" w:eastAsiaTheme="minorEastAsia" w:hAnsi="Times New Roman"/>
+          <w:rFonts w:asciiTheme="minorHAnsi" w:eastAsiaTheme="minorEastAsia" w:hAnsiTheme="minorHAnsi" w:cstheme="minorBidi"/>
           <w:b w:val="0"/>
           <w:bCs w:val="0"/>
           <w:caps w:val="0"/>
           <w:noProof/>
           <w:kern w:val="2"/>
-          <w:sz w:val="20"/>
-          <w:szCs w:val="20"/>
           <w:lang w:val="es-CO" w:eastAsia="es-CO"/>
           <w14:ligatures w14:val="standardContextual"/>
         </w:rPr>
       </w:pPr>
-      <w:r>
-        <w:rPr>
-          <w:rFonts w:ascii="Times New Roman" w:hAnsi="Times New Roman"/>
-          <w:sz w:val="20"/>
-          <w:szCs w:val="20"/>
-        </w:rPr>
-        <w:fldChar w:fldCharType="begin"/>
-      </w:r>
-      <w:r>
-        <w:rPr>
-          <w:rFonts w:ascii="Times New Roman" w:hAnsi="Times New Roman"/>
-          <w:sz w:val="20"/>
-          <w:szCs w:val="20"/>
-        </w:rPr>
-        <w:instrText xml:space="preserve"> TOC \h \z \t "Estilo2_Ilustraciones;1" </w:instrText>
-      </w:r>
-      <w:r>
-        <w:rPr>
-          <w:rFonts w:ascii="Times New Roman" w:hAnsi="Times New Roman"/>
-          <w:sz w:val="20"/>
-          <w:szCs w:val="20"/>
-        </w:rPr>
-        <w:fldChar w:fldCharType="separate"/>
-      </w:r>
-      <w:hyperlink w:anchor="_Toc228386589" w:history="1">
+      <w:hyperlink w:anchor="_Toc241394754" w:history="1">
         <w:r>
           <w:rPr>
             <w:rStyle w:val="Hipervnculo"/>
-            <w:rFonts w:ascii="Times New Roman" w:hAnsi="Times New Roman"/>
             <w:noProof/>
-            <w:sz w:val="20"/>
-            <w:szCs w:val="20"/>
           </w:rPr>
-          <w:t>Ilustración 1. Ejemplo de tablero Kanban</w:t>
+          <w:t>Tabla 15: Aplicar descuentos.</w:t>
         </w:r>
         <w:r>
           <w:rPr>
-            <w:rFonts w:ascii="Times New Roman" w:hAnsi="Times New Roman"/>
             <w:noProof/>
             <w:webHidden/>
-            <w:sz w:val="20"/>
-            <w:szCs w:val="20"/>
           </w:rPr>
           <w:tab/>
         </w:r>
         <w:r>
           <w:rPr>
-            <w:rFonts w:ascii="Times New Roman" w:hAnsi="Times New Roman"/>
             <w:noProof/>
             <w:webHidden/>
-            <w:sz w:val="20"/>
-            <w:szCs w:val="20"/>
           </w:rPr>
           <w:fldChar w:fldCharType="begin"/>
         </w:r>
         <w:r>
           <w:rPr>
-            <w:rFonts w:ascii="Times New Roman" w:hAnsi="Times New Roman"/>
             <w:noProof/>
             <w:webHidden/>
-            <w:sz w:val="20"/>
-            <w:szCs w:val="20"/>
           </w:rPr>
-          <w:instrText xml:space="preserve"> PAGEREF _Toc228386589 \h </w:instrText>
+          <w:instrText xml:space="preserve"> PAGEREF _Toc241394754 \h </w:instrText>
         </w:r>
         <w:r>
           <w:rPr>
-            <w:rFonts w:ascii="Times New Roman" w:hAnsi="Times New Roman"/>
             <w:noProof/>
             <w:webHidden/>
-            <w:sz w:val="20"/>
-            <w:szCs w:val="20"/>
           </w:rPr>
         </w:r>
         <w:r>
           <w:rPr>
-            <w:rFonts w:ascii="Times New Roman" w:hAnsi="Times New Roman"/>
             <w:noProof/>
             <w:webHidden/>
-            <w:sz w:val="20"/>
-            <w:szCs w:val="20"/>
           </w:rPr>
           <w:fldChar w:fldCharType="separate"/>
         </w:r>
         <w:r>
           <w:rPr>
-            <w:rFonts w:ascii="Times New Roman" w:hAnsi="Times New Roman"/>
             <w:noProof/>
             <w:webHidden/>
-            <w:sz w:val="20"/>
-            <w:szCs w:val="20"/>
           </w:rPr>
-          <w:t>23</w:t>
+          <w:t>34</w:t>
         </w:r>
         <w:r>
           <w:rPr>
-            <w:rFonts w:ascii="Times New Roman" w:hAnsi="Times New Roman"/>
             <w:noProof/>
             <w:webHidden/>
-            <w:sz w:val="20"/>
-            <w:szCs w:val="20"/>
           </w:rPr>
           <w:fldChar w:fldCharType="end"/>
         </w:r>
@@ -4758,95 +4621,69 @@
           <w:tab w:val="right" w:leader="dot" w:pos="9316"/>
         </w:tabs>
         <w:rPr>
-          <w:rFonts w:ascii="Times New Roman" w:eastAsiaTheme="minorEastAsia" w:hAnsi="Times New Roman"/>
+          <w:rFonts w:asciiTheme="minorHAnsi" w:eastAsiaTheme="minorEastAsia" w:hAnsiTheme="minorHAnsi" w:cstheme="minorBidi"/>
           <w:b w:val="0"/>
           <w:bCs w:val="0"/>
           <w:caps w:val="0"/>
           <w:noProof/>
           <w:kern w:val="2"/>
-          <w:sz w:val="20"/>
-          <w:szCs w:val="20"/>
           <w:lang w:val="es-CO" w:eastAsia="es-CO"/>
           <w14:ligatures w14:val="standardContextual"/>
         </w:rPr>
       </w:pPr>
-      <w:hyperlink w:anchor="_Toc228386590" w:history="1">
+      <w:hyperlink w:anchor="_Toc241394755" w:history="1">
         <w:r>
           <w:rPr>
             <w:rStyle w:val="Hipervnculo"/>
-            <w:rFonts w:ascii="Times New Roman" w:hAnsi="Times New Roman"/>
             <w:noProof/>
-            <w:sz w:val="20"/>
-            <w:szCs w:val="20"/>
           </w:rPr>
-          <w:t>Ilustración 2. Fases del proyecto</w:t>
+          <w:t>Tabla 16: Generar reporte PDF.</w:t>
         </w:r>
         <w:r>
           <w:rPr>
-            <w:rFonts w:ascii="Times New Roman" w:hAnsi="Times New Roman"/>
             <w:noProof/>
             <w:webHidden/>
-            <w:sz w:val="20"/>
-            <w:szCs w:val="20"/>
           </w:rPr>
           <w:tab/>
         </w:r>
         <w:r>
           <w:rPr>
-            <w:rFonts w:ascii="Times New Roman" w:hAnsi="Times New Roman"/>
             <w:noProof/>
             <w:webHidden/>
-            <w:sz w:val="20"/>
-            <w:szCs w:val="20"/>
           </w:rPr>
           <w:fldChar w:fldCharType="begin"/>
         </w:r>
         <w:r>
           <w:rPr>
-            <w:rFonts w:ascii="Times New Roman" w:hAnsi="Times New Roman"/>
             <w:noProof/>
             <w:webHidden/>
-            <w:sz w:val="20"/>
-            <w:szCs w:val="20"/>
           </w:rPr>
-          <w:instrText xml:space="preserve"> PAGEREF _Toc228386590 \h </w:instrText>
+          <w:instrText xml:space="preserve"> PAGEREF _Toc241394755 \h </w:instrText>
         </w:r>
         <w:r>
           <w:rPr>
-            <w:rFonts w:ascii="Times New Roman" w:hAnsi="Times New Roman"/>
             <w:noProof/>
             <w:webHidden/>
-            <w:sz w:val="20"/>
-            <w:szCs w:val="20"/>
           </w:rPr>
         </w:r>
         <w:r>
           <w:rPr>
-            <w:rFonts w:ascii="Times New Roman" w:hAnsi="Times New Roman"/>
             <w:noProof/>
             <w:webHidden/>
-            <w:sz w:val="20"/>
-            <w:szCs w:val="20"/>
           </w:rPr>
           <w:fldChar w:fldCharType="separate"/>
         </w:r>
         <w:r>
           <w:rPr>
-            <w:rFonts w:ascii="Times New Roman" w:hAnsi="Times New Roman"/>
             <w:noProof/>
             <w:webHidden/>
-            <w:sz w:val="20"/>
-            <w:szCs w:val="20"/>
           </w:rPr>
-          <w:t>25</w:t>
+          <w:t>34</w:t>
         </w:r>
         <w:r>
           <w:rPr>
-            <w:rFonts w:ascii="Times New Roman" w:hAnsi="Times New Roman"/>
             <w:noProof/>
             <w:webHidden/>
-            <w:sz w:val="20"/>
-            <w:szCs w:val="20"/>
           </w:rPr>
           <w:fldChar w:fldCharType="end"/>
         </w:r>
@@ -4859,95 +4696,69 @@
           <w:tab w:val="right" w:leader="dot" w:pos="9316"/>
         </w:tabs>
         <w:rPr>
-          <w:rFonts w:ascii="Times New Roman" w:eastAsiaTheme="minorEastAsia" w:hAnsi="Times New Roman"/>
+          <w:rFonts w:asciiTheme="minorHAnsi" w:eastAsiaTheme="minorEastAsia" w:hAnsiTheme="minorHAnsi" w:cstheme="minorBidi"/>
           <w:b w:val="0"/>
           <w:bCs w:val="0"/>
           <w:caps w:val="0"/>
           <w:noProof/>
           <w:kern w:val="2"/>
-          <w:sz w:val="20"/>
-          <w:szCs w:val="20"/>
           <w:lang w:val="es-CO" w:eastAsia="es-CO"/>
           <w14:ligatures w14:val="standardContextual"/>
         </w:rPr>
       </w:pPr>
-      <w:hyperlink w:anchor="_Toc228386591" w:history="1">
+      <w:hyperlink w:anchor="_Toc241394756" w:history="1">
         <w:r>
           <w:rPr>
             <w:rStyle w:val="Hipervnculo"/>
-            <w:rFonts w:ascii="Times New Roman" w:hAnsi="Times New Roman"/>
             <w:noProof/>
-            <w:sz w:val="20"/>
-            <w:szCs w:val="20"/>
           </w:rPr>
-          <w:t>Ilustración 3. Cronograma de actividades</w:t>
+          <w:t>Tabla 17: Alertar sobre stock bajo.</w:t>
         </w:r>
         <w:r>
           <w:rPr>
-            <w:rFonts w:ascii="Times New Roman" w:hAnsi="Times New Roman"/>
             <w:noProof/>
             <w:webHidden/>
-            <w:sz w:val="20"/>
-            <w:szCs w:val="20"/>
           </w:rPr>
           <w:tab/>
         </w:r>
         <w:r>
           <w:rPr>
-            <w:rFonts w:ascii="Times New Roman" w:hAnsi="Times New Roman"/>
             <w:noProof/>
             <w:webHidden/>
-            <w:sz w:val="20"/>
-            <w:szCs w:val="20"/>
           </w:rPr>
           <w:fldChar w:fldCharType="begin"/>
         </w:r>
         <w:r>
           <w:rPr>
-            <w:rFonts w:ascii="Times New Roman" w:hAnsi="Times New Roman"/>
             <w:noProof/>
             <w:webHidden/>
-            <w:sz w:val="20"/>
-            <w:szCs w:val="20"/>
           </w:rPr>
-          <w:instrText xml:space="preserve"> PAGEREF _Toc228386591 \h </w:instrText>
+          <w:instrText xml:space="preserve"> PAGEREF _Toc241394756 \h </w:instrText>
         </w:r>
         <w:r>
           <w:rPr>
-            <w:rFonts w:ascii="Times New Roman" w:hAnsi="Times New Roman"/>
             <w:noProof/>
             <w:webHidden/>
-            <w:sz w:val="20"/>
-            <w:szCs w:val="20"/>
           </w:rPr>
         </w:r>
         <w:r>
           <w:rPr>
-            <w:rFonts w:ascii="Times New Roman" w:hAnsi="Times New Roman"/>
             <w:noProof/>
             <w:webHidden/>
-            <w:sz w:val="20"/>
-            <w:szCs w:val="20"/>
           </w:rPr>
           <w:fldChar w:fldCharType="separate"/>
         </w:r>
         <w:r>
           <w:rPr>
-            <w:rFonts w:ascii="Times New Roman" w:hAnsi="Times New Roman"/>
             <w:noProof/>
             <w:webHidden/>
-            <w:sz w:val="20"/>
-            <w:szCs w:val="20"/>
           </w:rPr>
-          <w:t>28</w:t>
+          <w:t>35</w:t>
         </w:r>
         <w:r>
           <w:rPr>
-            <w:rFonts w:ascii="Times New Roman" w:hAnsi="Times New Roman"/>
             <w:noProof/>
             <w:webHidden/>
-            <w:sz w:val="20"/>
-            <w:szCs w:val="20"/>
           </w:rPr>
           <w:fldChar w:fldCharType="end"/>
         </w:r>
@@ -4960,95 +4771,69 @@
           <w:tab w:val="right" w:leader="dot" w:pos="9316"/>
         </w:tabs>
         <w:rPr>
-          <w:rFonts w:ascii="Times New Roman" w:eastAsiaTheme="minorEastAsia" w:hAnsi="Times New Roman"/>
+          <w:rFonts w:asciiTheme="minorHAnsi" w:eastAsiaTheme="minorEastAsia" w:hAnsiTheme="minorHAnsi" w:cstheme="minorBidi"/>
           <w:b w:val="0"/>
           <w:bCs w:val="0"/>
           <w:caps w:val="0"/>
           <w:noProof/>
           <w:kern w:val="2"/>
-          <w:sz w:val="20"/>
-          <w:szCs w:val="20"/>
           <w:lang w:val="es-CO" w:eastAsia="es-CO"/>
           <w14:ligatures w14:val="standardContextual"/>
         </w:rPr>
       </w:pPr>
-      <w:hyperlink w:anchor="_Toc228386592" w:history="1">
+      <w:hyperlink w:anchor="_Toc241394757" w:history="1">
         <w:r>
           <w:rPr>
             <w:rStyle w:val="Hipervnculo"/>
-            <w:rFonts w:ascii="Times New Roman" w:hAnsi="Times New Roman"/>
             <w:noProof/>
-            <w:sz w:val="20"/>
-            <w:szCs w:val="20"/>
           </w:rPr>
-          <w:t>Ilustración 4. Recursos humanos</w:t>
+          <w:t>Tabla 18: Alertar productos próximos a vencer.</w:t>
         </w:r>
         <w:r>
           <w:rPr>
-            <w:rFonts w:ascii="Times New Roman" w:hAnsi="Times New Roman"/>
             <w:noProof/>
             <w:webHidden/>
-            <w:sz w:val="20"/>
-            <w:szCs w:val="20"/>
           </w:rPr>
           <w:tab/>
         </w:r>
         <w:r>
           <w:rPr>
-            <w:rFonts w:ascii="Times New Roman" w:hAnsi="Times New Roman"/>
             <w:noProof/>
             <w:webHidden/>
-            <w:sz w:val="20"/>
-            <w:szCs w:val="20"/>
           </w:rPr>
           <w:fldChar w:fldCharType="begin"/>
         </w:r>
         <w:r>
           <w:rPr>
-            <w:rFonts w:ascii="Times New Roman" w:hAnsi="Times New Roman"/>
             <w:noProof/>
             <w:webHidden/>
-            <w:sz w:val="20"/>
-            <w:szCs w:val="20"/>
           </w:rPr>
-          <w:instrText xml:space="preserve"> PAGEREF _Toc228386592 \h </w:instrText>
+          <w:instrText xml:space="preserve"> PAGEREF _Toc241394757 \h </w:instrText>
         </w:r>
         <w:r>
           <w:rPr>
-            <w:rFonts w:ascii="Times New Roman" w:hAnsi="Times New Roman"/>
             <w:noProof/>
             <w:webHidden/>
-            <w:sz w:val="20"/>
-            <w:szCs w:val="20"/>
           </w:rPr>
         </w:r>
         <w:r>
           <w:rPr>
-            <w:rFonts w:ascii="Times New Roman" w:hAnsi="Times New Roman"/>
             <w:noProof/>
             <w:webHidden/>
-            <w:sz w:val="20"/>
-            <w:szCs w:val="20"/>
           </w:rPr>
           <w:fldChar w:fldCharType="separate"/>
         </w:r>
         <w:r>
           <w:rPr>
-            <w:rFonts w:ascii="Times New Roman" w:hAnsi="Times New Roman"/>
             <w:noProof/>
             <w:webHidden/>
-            <w:sz w:val="20"/>
-            <w:szCs w:val="20"/>
           </w:rPr>
-          <w:t>29</w:t>
+          <w:t>35</w:t>
         </w:r>
         <w:r>
           <w:rPr>
-            <w:rFonts w:ascii="Times New Roman" w:hAnsi="Times New Roman"/>
             <w:noProof/>
             <w:webHidden/>
-            <w:sz w:val="20"/>
-            <w:szCs w:val="20"/>
           </w:rPr>
           <w:fldChar w:fldCharType="end"/>
         </w:r>
@@ -5061,95 +4846,69 @@
           <w:tab w:val="right" w:leader="dot" w:pos="9316"/>
         </w:tabs>
         <w:rPr>
-          <w:rFonts w:ascii="Times New Roman" w:eastAsiaTheme="minorEastAsia" w:hAnsi="Times New Roman"/>
+          <w:rFonts w:asciiTheme="minorHAnsi" w:eastAsiaTheme="minorEastAsia" w:hAnsiTheme="minorHAnsi" w:cstheme="minorBidi"/>
           <w:b w:val="0"/>
           <w:bCs w:val="0"/>
           <w:caps w:val="0"/>
           <w:noProof/>
           <w:kern w:val="2"/>
-          <w:sz w:val="20"/>
-          <w:szCs w:val="20"/>
           <w:lang w:val="es-CO" w:eastAsia="es-CO"/>
           <w14:ligatures w14:val="standardContextual"/>
         </w:rPr>
       </w:pPr>
-      <w:hyperlink w:anchor="_Toc228386593" w:history="1">
+      <w:hyperlink w:anchor="_Toc241394758" w:history="1">
         <w:r>
           <w:rPr>
             <w:rStyle w:val="Hipervnculo"/>
-            <w:rFonts w:ascii="Times New Roman" w:hAnsi="Times New Roman"/>
             <w:noProof/>
-            <w:sz w:val="20"/>
-            <w:szCs w:val="20"/>
           </w:rPr>
-          <w:t>Ilustración 5. Recursos tecnológicos</w:t>
+          <w:t>Tabla 19: Inicio de sesión.</w:t>
         </w:r>
         <w:r>
           <w:rPr>
-            <w:rFonts w:ascii="Times New Roman" w:hAnsi="Times New Roman"/>
             <w:noProof/>
             <w:webHidden/>
-            <w:sz w:val="20"/>
-            <w:szCs w:val="20"/>
           </w:rPr>
           <w:tab/>
         </w:r>
         <w:r>
           <w:rPr>
-            <w:rFonts w:ascii="Times New Roman" w:hAnsi="Times New Roman"/>
             <w:noProof/>
             <w:webHidden/>
-            <w:sz w:val="20"/>
-            <w:szCs w:val="20"/>
           </w:rPr>
           <w:fldChar w:fldCharType="begin"/>
         </w:r>
         <w:r>
           <w:rPr>
-            <w:rFonts w:ascii="Times New Roman" w:hAnsi="Times New Roman"/>
             <w:noProof/>
             <w:webHidden/>
-            <w:sz w:val="20"/>
-            <w:szCs w:val="20"/>
           </w:rPr>
-          <w:instrText xml:space="preserve"> PAGEREF _Toc228386593 \h </w:instrText>
+          <w:instrText xml:space="preserve"> PAGEREF _Toc241394758 \h </w:instrText>
         </w:r>
         <w:r>
           <w:rPr>
-            <w:rFonts w:ascii="Times New Roman" w:hAnsi="Times New Roman"/>
             <w:noProof/>
             <w:webHidden/>
-            <w:sz w:val="20"/>
-            <w:szCs w:val="20"/>
           </w:rPr>
         </w:r>
         <w:r>
           <w:rPr>
-            <w:rFonts w:ascii="Times New Roman" w:hAnsi="Times New Roman"/>
             <w:noProof/>
             <w:webHidden/>
-            <w:sz w:val="20"/>
-            <w:szCs w:val="20"/>
           </w:rPr>
           <w:fldChar w:fldCharType="separate"/>
         </w:r>
         <w:r>
           <w:rPr>
-            <w:rFonts w:ascii="Times New Roman" w:hAnsi="Times New Roman"/>
             <w:noProof/>
             <w:webHidden/>
-            <w:sz w:val="20"/>
-            <w:szCs w:val="20"/>
           </w:rPr>
-          <w:t>29</w:t>
+          <w:t>36</w:t>
         </w:r>
         <w:r>
           <w:rPr>
-            <w:rFonts w:ascii="Times New Roman" w:hAnsi="Times New Roman"/>
             <w:noProof/>
             <w:webHidden/>
-            <w:sz w:val="20"/>
-            <w:szCs w:val="20"/>
           </w:rPr>
           <w:fldChar w:fldCharType="end"/>
         </w:r>
@@ -5162,95 +4921,630 @@
           <w:tab w:val="right" w:leader="dot" w:pos="9316"/>
         </w:tabs>
         <w:rPr>
-          <w:rFonts w:ascii="Times New Roman" w:eastAsiaTheme="minorEastAsia" w:hAnsi="Times New Roman"/>
+          <w:rFonts w:asciiTheme="minorHAnsi" w:eastAsiaTheme="minorEastAsia" w:hAnsiTheme="minorHAnsi" w:cstheme="minorBidi"/>
           <w:b w:val="0"/>
           <w:bCs w:val="0"/>
           <w:caps w:val="0"/>
           <w:noProof/>
           <w:kern w:val="2"/>
-          <w:sz w:val="20"/>
-          <w:szCs w:val="20"/>
           <w:lang w:val="es-CO" w:eastAsia="es-CO"/>
           <w14:ligatures w14:val="standardContextual"/>
         </w:rPr>
       </w:pPr>
-      <w:hyperlink w:anchor="_Toc228386594" w:history="1">
+      <w:hyperlink w:anchor="_Toc241394759" w:history="1">
         <w:r>
           <w:rPr>
             <w:rStyle w:val="Hipervnculo"/>
-            <w:rFonts w:ascii="Times New Roman" w:hAnsi="Times New Roman"/>
             <w:noProof/>
-            <w:sz w:val="20"/>
-            <w:szCs w:val="20"/>
           </w:rPr>
-          <w:t>Ilustración 6. costo total</w:t>
+          <w:t>Tabla 20: Registrar entrada mercancía.</w:t>
         </w:r>
         <w:r>
           <w:rPr>
-            <w:rFonts w:ascii="Times New Roman" w:hAnsi="Times New Roman"/>
             <w:noProof/>
             <w:webHidden/>
-            <w:sz w:val="20"/>
-            <w:szCs w:val="20"/>
           </w:rPr>
           <w:tab/>
         </w:r>
         <w:r>
           <w:rPr>
-            <w:rFonts w:ascii="Times New Roman" w:hAnsi="Times New Roman"/>
             <w:noProof/>
             <w:webHidden/>
-            <w:sz w:val="20"/>
-            <w:szCs w:val="20"/>
           </w:rPr>
           <w:fldChar w:fldCharType="begin"/>
         </w:r>
         <w:r>
           <w:rPr>
-            <w:rFonts w:ascii="Times New Roman" w:hAnsi="Times New Roman"/>
             <w:noProof/>
             <w:webHidden/>
-            <w:sz w:val="20"/>
-            <w:szCs w:val="20"/>
           </w:rPr>
-          <w:instrText xml:space="preserve"> PAGEREF _Toc228386594 \h </w:instrText>
+          <w:instrText xml:space="preserve"> PAGEREF _Toc241394759 \h </w:instrText>
         </w:r>
         <w:r>
           <w:rPr>
-            <w:rFonts w:ascii="Times New Roman" w:hAnsi="Times New Roman"/>
             <w:noProof/>
             <w:webHidden/>
-            <w:sz w:val="20"/>
-            <w:szCs w:val="20"/>
           </w:rPr>
         </w:r>
         <w:r>
           <w:rPr>
-            <w:rFonts w:ascii="Times New Roman" w:hAnsi="Times New Roman"/>
             <w:noProof/>
             <w:webHidden/>
-            <w:sz w:val="20"/>
-            <w:szCs w:val="20"/>
           </w:rPr>
           <w:fldChar w:fldCharType="separate"/>
         </w:r>
         <w:r>
           <w:rPr>
-            <w:rFonts w:ascii="Times New Roman" w:hAnsi="Times New Roman"/>
             <w:noProof/>
             <w:webHidden/>
-            <w:sz w:val="20"/>
-            <w:szCs w:val="20"/>
           </w:rPr>
-          <w:t>30</w:t>
+          <w:t>36</w:t>
         </w:r>
         <w:r>
           <w:rPr>
-            <w:rFonts w:ascii="Times New Roman" w:hAnsi="Times New Roman"/>
             <w:noProof/>
             <w:webHidden/>
-            <w:sz w:val="20"/>
-            <w:szCs w:val="20"/>
+          </w:rPr>
+          <w:fldChar w:fldCharType="end"/>
+        </w:r>
+      </w:hyperlink>
+    </w:p>
+    <w:p>
+      <w:pPr>
+        <w:pStyle w:val="TDC1"/>
+        <w:tabs>
+          <w:tab w:val="right" w:leader="dot" w:pos="9316"/>
+        </w:tabs>
+        <w:rPr>
+          <w:rFonts w:asciiTheme="minorHAnsi" w:eastAsiaTheme="minorEastAsia" w:hAnsiTheme="minorHAnsi" w:cstheme="minorBidi"/>
+          <w:b w:val="0"/>
+          <w:bCs w:val="0"/>
+          <w:caps w:val="0"/>
+          <w:noProof/>
+          <w:kern w:val="2"/>
+          <w:lang w:val="es-CO" w:eastAsia="es-CO"/>
+          <w14:ligatures w14:val="standardContextual"/>
+        </w:rPr>
+      </w:pPr>
+      <w:hyperlink w:anchor="_Toc241394760" w:history="1">
+        <w:r>
+          <w:rPr>
+            <w:rStyle w:val="Hipervnculo"/>
+            <w:noProof/>
+          </w:rPr>
+          <w:t>Tabla 21: Anular una venta.</w:t>
+        </w:r>
+        <w:r>
+          <w:rPr>
+            <w:noProof/>
+            <w:webHidden/>
+          </w:rPr>
+          <w:tab/>
+        </w:r>
+        <w:r>
+          <w:rPr>
+            <w:noProof/>
+            <w:webHidden/>
+          </w:rPr>
+          <w:fldChar w:fldCharType="begin"/>
+        </w:r>
+        <w:r>
+          <w:rPr>
+            <w:noProof/>
+            <w:webHidden/>
+          </w:rPr>
+          <w:instrText xml:space="preserve"> PAGEREF _Toc241394760 \h </w:instrText>
+        </w:r>
+        <w:r>
+          <w:rPr>
+            <w:noProof/>
+            <w:webHidden/>
+          </w:rPr>
+        </w:r>
+        <w:r>
+          <w:rPr>
+            <w:noProof/>
+            <w:webHidden/>
+          </w:rPr>
+          <w:fldChar w:fldCharType="separate"/>
+        </w:r>
+        <w:r>
+          <w:rPr>
+            <w:noProof/>
+            <w:webHidden/>
+          </w:rPr>
+          <w:t>36</w:t>
+        </w:r>
+        <w:r>
+          <w:rPr>
+            <w:noProof/>
+            <w:webHidden/>
+          </w:rPr>
+          <w:fldChar w:fldCharType="end"/>
+        </w:r>
+      </w:hyperlink>
+    </w:p>
+    <w:p>
+      <w:pPr>
+        <w:spacing w:line="240" w:lineRule="auto"/>
+        <w:ind w:firstLine="0"/>
+        <w:rPr>
+          <w:b/>
+          <w:bCs/>
+        </w:rPr>
+      </w:pPr>
+      <w:r>
+        <w:rPr>
+          <w:caps/>
+          <w:sz w:val="20"/>
+          <w:szCs w:val="20"/>
+        </w:rPr>
+        <w:fldChar w:fldCharType="end"/>
+      </w:r>
+    </w:p>
+    <w:p>
+      <w:pPr>
+        <w:spacing w:line="240" w:lineRule="auto"/>
+        <w:ind w:firstLine="0"/>
+        <w:jc w:val="center"/>
+        <w:rPr>
+          <w:b/>
+          <w:bCs/>
+        </w:rPr>
+      </w:pPr>
+    </w:p>
+    <w:p>
+      <w:pPr>
+        <w:spacing w:line="240" w:lineRule="auto"/>
+        <w:ind w:firstLine="0"/>
+        <w:jc w:val="left"/>
+        <w:rPr>
+          <w:b/>
+          <w:bCs/>
+        </w:rPr>
+      </w:pPr>
+      <w:r>
+        <w:rPr>
+          <w:b/>
+          <w:bCs/>
+        </w:rPr>
+        <w:br w:type="page"/>
+      </w:r>
+    </w:p>
+    <w:p>
+      <w:pPr>
+        <w:spacing w:line="240" w:lineRule="auto"/>
+        <w:ind w:firstLine="0"/>
+        <w:jc w:val="center"/>
+        <w:rPr>
+          <w:b/>
+          <w:bCs/>
+        </w:rPr>
+      </w:pPr>
+    </w:p>
+    <w:p>
+      <w:pPr>
+        <w:spacing w:line="240" w:lineRule="auto"/>
+        <w:ind w:firstLine="0"/>
+        <w:jc w:val="left"/>
+        <w:rPr>
+          <w:b/>
+          <w:bCs/>
+        </w:rPr>
+      </w:pPr>
+    </w:p>
+    <w:p>
+      <w:pPr>
+        <w:spacing w:line="240" w:lineRule="auto"/>
+        <w:ind w:firstLine="0"/>
+        <w:jc w:val="center"/>
+        <w:rPr>
+          <w:b/>
+          <w:bCs/>
+        </w:rPr>
+      </w:pPr>
+      <w:r>
+        <w:rPr>
+          <w:b/>
+          <w:bCs/>
+        </w:rPr>
+        <w:t>Índice de Figuras</w:t>
+      </w:r>
+    </w:p>
+    <w:p>
+      <w:pPr>
+        <w:pStyle w:val="TDC1"/>
+        <w:tabs>
+          <w:tab w:val="right" w:leader="dot" w:pos="9316"/>
+        </w:tabs>
+        <w:rPr>
+          <w:rFonts w:asciiTheme="minorHAnsi" w:eastAsiaTheme="minorEastAsia" w:hAnsiTheme="minorHAnsi" w:cstheme="minorBidi"/>
+          <w:b w:val="0"/>
+          <w:bCs w:val="0"/>
+          <w:caps w:val="0"/>
+          <w:noProof/>
+          <w:kern w:val="2"/>
+          <w:lang w:val="es-CO" w:eastAsia="es-CO"/>
+          <w14:ligatures w14:val="standardContextual"/>
+        </w:rPr>
+      </w:pPr>
+      <w:r>
+        <w:rPr>
+          <w:rFonts w:ascii="Times New Roman" w:hAnsi="Times New Roman"/>
+          <w:sz w:val="20"/>
+          <w:szCs w:val="20"/>
+        </w:rPr>
+        <w:fldChar w:fldCharType="begin"/>
+      </w:r>
+      <w:r>
+        <w:rPr>
+          <w:rFonts w:ascii="Times New Roman" w:hAnsi="Times New Roman"/>
+          <w:sz w:val="20"/>
+          <w:szCs w:val="20"/>
+        </w:rPr>
+        <w:instrText xml:space="preserve"> TOC \h \z \t "Estilo2_Ilustraciones;1" </w:instrText>
+      </w:r>
+      <w:r>
+        <w:rPr>
+          <w:rFonts w:ascii="Times New Roman" w:hAnsi="Times New Roman"/>
+          <w:sz w:val="20"/>
+          <w:szCs w:val="20"/>
+        </w:rPr>
+        <w:fldChar w:fldCharType="separate"/>
+      </w:r>
+      <w:hyperlink w:anchor="_Toc241481019" w:history="1">
+        <w:r>
+          <w:rPr>
+            <w:rStyle w:val="Hipervnculo"/>
+            <w:noProof/>
+          </w:rPr>
+          <w:t>Ilustración 1. Ejemplo de tablero Kanban</w:t>
+        </w:r>
+        <w:r>
+          <w:rPr>
+            <w:noProof/>
+            <w:webHidden/>
+          </w:rPr>
+          <w:tab/>
+        </w:r>
+        <w:r>
+          <w:rPr>
+            <w:noProof/>
+            <w:webHidden/>
+          </w:rPr>
+          <w:fldChar w:fldCharType="begin"/>
+        </w:r>
+        <w:r>
+          <w:rPr>
+            <w:noProof/>
+            <w:webHidden/>
+          </w:rPr>
+          <w:instrText xml:space="preserve"> PAGEREF _Toc241481019 \h </w:instrText>
+        </w:r>
+        <w:r>
+          <w:rPr>
+            <w:noProof/>
+            <w:webHidden/>
+          </w:rPr>
+        </w:r>
+        <w:r>
+          <w:rPr>
+            <w:noProof/>
+            <w:webHidden/>
+          </w:rPr>
+          <w:fldChar w:fldCharType="separate"/>
+        </w:r>
+        <w:r>
+          <w:rPr>
+            <w:noProof/>
+            <w:webHidden/>
+          </w:rPr>
+          <w:t>24</w:t>
+        </w:r>
+        <w:r>
+          <w:rPr>
+            <w:noProof/>
+            <w:webHidden/>
+          </w:rPr>
+          <w:fldChar w:fldCharType="end"/>
+        </w:r>
+      </w:hyperlink>
+    </w:p>
+    <w:p>
+      <w:pPr>
+        <w:pStyle w:val="TDC1"/>
+        <w:tabs>
+          <w:tab w:val="right" w:leader="dot" w:pos="9316"/>
+        </w:tabs>
+        <w:rPr>
+          <w:rFonts w:asciiTheme="minorHAnsi" w:eastAsiaTheme="minorEastAsia" w:hAnsiTheme="minorHAnsi" w:cstheme="minorBidi"/>
+          <w:b w:val="0"/>
+          <w:bCs w:val="0"/>
+          <w:caps w:val="0"/>
+          <w:noProof/>
+          <w:kern w:val="2"/>
+          <w:lang w:val="es-CO" w:eastAsia="es-CO"/>
+          <w14:ligatures w14:val="standardContextual"/>
+        </w:rPr>
+      </w:pPr>
+      <w:hyperlink w:anchor="_Toc241481020" w:history="1">
+        <w:r>
+          <w:rPr>
+            <w:rStyle w:val="Hipervnculo"/>
+            <w:noProof/>
+          </w:rPr>
+          <w:t>Ilustración 2. Fases del proyecto</w:t>
+        </w:r>
+        <w:r>
+          <w:rPr>
+            <w:noProof/>
+            <w:webHidden/>
+          </w:rPr>
+          <w:tab/>
+        </w:r>
+        <w:r>
+          <w:rPr>
+            <w:noProof/>
+            <w:webHidden/>
+          </w:rPr>
+          <w:fldChar w:fldCharType="begin"/>
+        </w:r>
+        <w:r>
+          <w:rPr>
+            <w:noProof/>
+            <w:webHidden/>
+          </w:rPr>
+          <w:instrText xml:space="preserve"> PAGEREF _Toc241481020 \h </w:instrText>
+        </w:r>
+        <w:r>
+          <w:rPr>
+            <w:noProof/>
+            <w:webHidden/>
+          </w:rPr>
+        </w:r>
+        <w:r>
+          <w:rPr>
+            <w:noProof/>
+            <w:webHidden/>
+          </w:rPr>
+          <w:fldChar w:fldCharType="separate"/>
+        </w:r>
+        <w:r>
+          <w:rPr>
+            <w:noProof/>
+            <w:webHidden/>
+          </w:rPr>
+          <w:t>26</w:t>
+        </w:r>
+        <w:r>
+          <w:rPr>
+            <w:noProof/>
+            <w:webHidden/>
+          </w:rPr>
+          <w:fldChar w:fldCharType="end"/>
+        </w:r>
+      </w:hyperlink>
+    </w:p>
+    <w:p>
+      <w:pPr>
+        <w:pStyle w:val="TDC1"/>
+        <w:tabs>
+          <w:tab w:val="right" w:leader="dot" w:pos="9316"/>
+        </w:tabs>
+        <w:rPr>
+          <w:rFonts w:asciiTheme="minorHAnsi" w:eastAsiaTheme="minorEastAsia" w:hAnsiTheme="minorHAnsi" w:cstheme="minorBidi"/>
+          <w:b w:val="0"/>
+          <w:bCs w:val="0"/>
+          <w:caps w:val="0"/>
+          <w:noProof/>
+          <w:kern w:val="2"/>
+          <w:lang w:val="es-CO" w:eastAsia="es-CO"/>
+          <w14:ligatures w14:val="standardContextual"/>
+        </w:rPr>
+      </w:pPr>
+      <w:hyperlink w:anchor="_Toc241481021" w:history="1">
+        <w:r>
+          <w:rPr>
+            <w:rStyle w:val="Hipervnculo"/>
+            <w:noProof/>
+          </w:rPr>
+          <w:t>Ilustración 3: Diagrama E-R 1.0</w:t>
+        </w:r>
+        <w:r>
+          <w:rPr>
+            <w:noProof/>
+            <w:webHidden/>
+          </w:rPr>
+          <w:tab/>
+        </w:r>
+        <w:r>
+          <w:rPr>
+            <w:noProof/>
+            <w:webHidden/>
+          </w:rPr>
+          <w:fldChar w:fldCharType="begin"/>
+        </w:r>
+        <w:r>
+          <w:rPr>
+            <w:noProof/>
+            <w:webHidden/>
+          </w:rPr>
+          <w:instrText xml:space="preserve"> PAGEREF _Toc241481021 \h </w:instrText>
+        </w:r>
+        <w:r>
+          <w:rPr>
+            <w:noProof/>
+            <w:webHidden/>
+          </w:rPr>
+        </w:r>
+        <w:r>
+          <w:rPr>
+            <w:noProof/>
+            <w:webHidden/>
+          </w:rPr>
+          <w:fldChar w:fldCharType="separate"/>
+        </w:r>
+        <w:r>
+          <w:rPr>
+            <w:noProof/>
+            <w:webHidden/>
+          </w:rPr>
+          <w:t>37</w:t>
+        </w:r>
+        <w:r>
+          <w:rPr>
+            <w:noProof/>
+            <w:webHidden/>
+          </w:rPr>
+          <w:fldChar w:fldCharType="end"/>
+        </w:r>
+      </w:hyperlink>
+    </w:p>
+    <w:p>
+      <w:pPr>
+        <w:pStyle w:val="TDC1"/>
+        <w:tabs>
+          <w:tab w:val="right" w:leader="dot" w:pos="9316"/>
+        </w:tabs>
+        <w:rPr>
+          <w:rFonts w:asciiTheme="minorHAnsi" w:eastAsiaTheme="minorEastAsia" w:hAnsiTheme="minorHAnsi" w:cstheme="minorBidi"/>
+          <w:b w:val="0"/>
+          <w:bCs w:val="0"/>
+          <w:caps w:val="0"/>
+          <w:noProof/>
+          <w:kern w:val="2"/>
+          <w:lang w:val="es-CO" w:eastAsia="es-CO"/>
+          <w14:ligatures w14:val="standardContextual"/>
+        </w:rPr>
+      </w:pPr>
+      <w:hyperlink w:anchor="_Toc241481022" w:history="1">
+        <w:r>
+          <w:rPr>
+            <w:rStyle w:val="Hipervnculo"/>
+            <w:noProof/>
+          </w:rPr>
+          <w:t>Ilustración 4: Diagrama E-R 2.0</w:t>
+        </w:r>
+        <w:r>
+          <w:rPr>
+            <w:noProof/>
+            <w:webHidden/>
+          </w:rPr>
+          <w:tab/>
+        </w:r>
+        <w:r>
+          <w:rPr>
+            <w:noProof/>
+            <w:webHidden/>
+          </w:rPr>
+          <w:fldChar w:fldCharType="begin"/>
+        </w:r>
+        <w:r>
+          <w:rPr>
+            <w:noProof/>
+            <w:webHidden/>
+          </w:rPr>
+          <w:instrText xml:space="preserve"> PAGEREF _Toc241481022 \h </w:instrText>
+        </w:r>
+        <w:r>
+          <w:rPr>
+            <w:noProof/>
+            <w:webHidden/>
+          </w:rPr>
+        </w:r>
+        <w:r>
+          <w:rPr>
+            <w:noProof/>
+            <w:webHidden/>
+          </w:rPr>
+          <w:fldChar w:fldCharType="separate"/>
+        </w:r>
+        <w:r>
+          <w:rPr>
+            <w:noProof/>
+            <w:webHidden/>
+          </w:rPr>
+          <w:t>38</w:t>
+        </w:r>
+        <w:r>
+          <w:rPr>
+            <w:noProof/>
+            <w:webHidden/>
+          </w:rPr>
+          <w:fldChar w:fldCharType="end"/>
+        </w:r>
+      </w:hyperlink>
+    </w:p>
+    <w:p>
+      <w:pPr>
+        <w:pStyle w:val="TDC1"/>
+        <w:tabs>
+          <w:tab w:val="right" w:leader="dot" w:pos="9316"/>
+        </w:tabs>
+        <w:rPr>
+          <w:rFonts w:asciiTheme="minorHAnsi" w:eastAsiaTheme="minorEastAsia" w:hAnsiTheme="minorHAnsi" w:cstheme="minorBidi"/>
+          <w:b w:val="0"/>
+          <w:bCs w:val="0"/>
+          <w:caps w:val="0"/>
+          <w:noProof/>
+          <w:kern w:val="2"/>
+          <w:lang w:val="es-CO" w:eastAsia="es-CO"/>
+          <w14:ligatures w14:val="standardContextual"/>
+        </w:rPr>
+      </w:pPr>
+      <w:hyperlink w:anchor="_Toc241481023" w:history="1">
+        <w:r>
+          <w:rPr>
+            <w:rStyle w:val="Hipervnculo"/>
+            <w:noProof/>
+          </w:rPr>
+          <w:t>Ilustración 5: Diagrama de casos de uso</w:t>
+        </w:r>
+        <w:r>
+          <w:rPr>
+            <w:noProof/>
+            <w:webHidden/>
+          </w:rPr>
+          <w:tab/>
+        </w:r>
+        <w:r>
+          <w:rPr>
+            <w:noProof/>
+            <w:webHidden/>
+          </w:rPr>
+          <w:fldChar w:fldCharType="begin"/>
+        </w:r>
+        <w:r>
+          <w:rPr>
+            <w:noProof/>
+            <w:webHidden/>
+          </w:rPr>
+          <w:instrText xml:space="preserve"> PAGEREF _Toc241481023 \h </w:instrText>
+        </w:r>
+        <w:r>
+          <w:rPr>
+            <w:noProof/>
+            <w:webHidden/>
+          </w:rPr>
+        </w:r>
+        <w:r>
+          <w:rPr>
+            <w:noProof/>
+            <w:webHidden/>
+          </w:rPr>
+          <w:fldChar w:fldCharType="separate"/>
+        </w:r>
+        <w:r>
+          <w:rPr>
+            <w:noProof/>
+            <w:webHidden/>
+          </w:rPr>
+          <w:t>39</w:t>
+        </w:r>
+        <w:r>
+          <w:rPr>
+            <w:noProof/>
+            <w:webHidden/>
           </w:rPr>
           <w:fldChar w:fldCharType="end"/>
         </w:r>
@@ -10060,7 +10354,10 @@
     </w:p>
     <w:p>
       <w:r>
-        <w:t>El sistema estará conformado por módulos funcionales integrados, orientados a la automatización y control operativo del negocio con rol único (sin empleados):</w:t>
+        <w:t>Este sistema está compuesto por diferentes módulos que organizan sus funcionalidades en áreas específicas. A continuación, estos se ven a detalle</w:t>
+      </w:r>
+      <w:r>
+        <w:t>:</w:t>
       </w:r>
     </w:p>
     <w:p>
@@ -12814,7 +13111,7 @@
       <w:pPr>
         <w:pStyle w:val="EstiloTablas"/>
       </w:pPr>
-      <w:bookmarkStart w:id="91" w:name="_Toc240230357"/>
+      <w:bookmarkStart w:id="91" w:name="_Toc241394740"/>
       <w:bookmarkStart w:id="92" w:name="_Hlk240222949"/>
       <w:bookmarkStart w:id="93" w:name="_Hlk240222868"/>
       <w:r>
@@ -20717,7 +21014,7 @@
       <w:pPr>
         <w:pStyle w:val="EstiloTablas"/>
       </w:pPr>
-      <w:bookmarkStart w:id="104" w:name="_Toc240230358"/>
+      <w:bookmarkStart w:id="104" w:name="_Toc241394741"/>
       <w:r>
         <w:t>Tabla</w:t>
       </w:r>
@@ -21785,7 +22082,7 @@
       <w:pPr>
         <w:pStyle w:val="EstiloTablas"/>
       </w:pPr>
-      <w:bookmarkStart w:id="108" w:name="_Toc240230359"/>
+      <w:bookmarkStart w:id="108" w:name="_Toc241394742"/>
       <w:r>
         <w:t>Tabla</w:t>
       </w:r>
@@ -22332,7 +22629,7 @@
       <w:pPr>
         <w:pStyle w:val="EstiloTablas"/>
       </w:pPr>
-      <w:bookmarkStart w:id="109" w:name="_Toc240230360"/>
+      <w:bookmarkStart w:id="109" w:name="_Toc241394743"/>
       <w:r>
         <w:t>Tabla</w:t>
       </w:r>
@@ -23051,11 +23348,8 @@
     <w:p>
       <w:pPr>
         <w:pStyle w:val="Estilo2Ilustraciones"/>
-        <w:rPr>
-          <w:noProof/>
-        </w:rPr>
-      </w:pPr>
-      <w:bookmarkStart w:id="119" w:name="_Toc228386589"/>
+      </w:pPr>
+      <w:bookmarkStart w:id="119" w:name="_Toc241481019"/>
       <w:r>
         <w:t xml:space="preserve">Ilustración </w:t>
       </w:r>
@@ -23069,9 +23363,6 @@
         <w:fldChar w:fldCharType="separate"/>
       </w:r>
       <w:r>
-        <w:rPr>
-          <w:noProof/>
-        </w:rPr>
         <w:t>1</w:t>
       </w:r>
       <w:r>
@@ -23096,7 +23387,7 @@
           <w:szCs w:val="18"/>
         </w:rPr>
         <w:drawing>
-          <wp:anchor distT="0" distB="0" distL="114300" distR="114300" simplePos="0" relativeHeight="251658240" behindDoc="0" locked="0" layoutInCell="1" allowOverlap="1" wp14:anchorId="1CDB1097" wp14:editId="3E9C573C">
+          <wp:anchor distT="0" distB="0" distL="114300" distR="114300" simplePos="0" relativeHeight="251657216" behindDoc="0" locked="0" layoutInCell="1" allowOverlap="1" wp14:anchorId="1CDB1097" wp14:editId="3E9C573C">
             <wp:simplePos x="0" y="0"/>
             <wp:positionH relativeFrom="column">
               <wp:posOffset>383402</wp:posOffset>
@@ -24020,7 +24311,7 @@
       <w:pPr>
         <w:pStyle w:val="Estilo2Ilustraciones"/>
       </w:pPr>
-      <w:bookmarkStart w:id="130" w:name="_Toc228386590"/>
+      <w:bookmarkStart w:id="130" w:name="_Toc241481020"/>
       <w:r>
         <w:lastRenderedPageBreak/>
         <w:t xml:space="preserve">Ilustración </w:t>
@@ -29892,6 +30183,47 @@
     </w:p>
     <w:p>
       <w:pPr>
+        <w:pStyle w:val="Prrafodelista"/>
+        <w:numPr>
+          <w:ilvl w:val="0"/>
+          <w:numId w:val="44"/>
+        </w:numPr>
+        <w:tabs>
+          <w:tab w:val="left" w:pos="1079"/>
+        </w:tabs>
+        <w:jc w:val="left"/>
+      </w:pPr>
+      <w:r>
+        <w:t>El sistema deberá funcionar de manera local sin requerir una conexión permanente a Internet.</w:t>
+      </w:r>
+    </w:p>
+    <w:p>
+      <w:pPr>
+        <w:pStyle w:val="Prrafodelista"/>
+        <w:numPr>
+          <w:ilvl w:val="0"/>
+          <w:numId w:val="44"/>
+        </w:numPr>
+        <w:tabs>
+          <w:tab w:val="left" w:pos="1079"/>
+        </w:tabs>
+        <w:jc w:val="left"/>
+      </w:pPr>
+      <w:r>
+        <w:t>El sistema deberá contar con una interfaz intuitiva y fácil de utilizar para el administrador.</w:t>
+      </w:r>
+    </w:p>
+    <w:p>
+      <w:pPr>
+        <w:tabs>
+          <w:tab w:val="left" w:pos="1079"/>
+        </w:tabs>
+        <w:ind w:left="1440" w:firstLine="0"/>
+        <w:jc w:val="left"/>
+      </w:pPr>
+    </w:p>
+    <w:p>
+      <w:pPr>
         <w:tabs>
           <w:tab w:val="left" w:pos="1079"/>
         </w:tabs>
@@ -29904,6 +30236,7 @@
         <w:pStyle w:val="Ttulo2"/>
       </w:pPr>
       <w:r>
+        <w:lastRenderedPageBreak/>
         <w:t>Historias de usuario</w:t>
       </w:r>
     </w:p>
@@ -29911,7 +30244,7 @@
       <w:pPr>
         <w:pStyle w:val="EstiloTablas"/>
       </w:pPr>
-      <w:bookmarkStart w:id="136" w:name="_Toc240230361"/>
+      <w:bookmarkStart w:id="136" w:name="_Toc241394744"/>
       <w:r>
         <w:t>Tabla 5: Registrar productos.</w:t>
       </w:r>
@@ -29994,7 +30327,6 @@
                 <w:b/>
                 <w:bCs/>
               </w:rPr>
-              <w:lastRenderedPageBreak/>
               <w:t>para</w:t>
             </w:r>
             <w:r>
@@ -30018,7 +30350,6 @@
                 <w:b/>
                 <w:bCs/>
               </w:rPr>
-              <w:lastRenderedPageBreak/>
               <w:t>Criterios de aceptación:</w:t>
             </w:r>
           </w:p>
@@ -30092,7 +30423,7 @@
       <w:pPr>
         <w:pStyle w:val="EstiloTablas"/>
       </w:pPr>
-      <w:bookmarkStart w:id="137" w:name="_Toc240230362"/>
+      <w:bookmarkStart w:id="137" w:name="_Toc241394745"/>
       <w:r>
         <w:t>Tabla 6: Actualizar productos.</w:t>
       </w:r>
@@ -30263,7 +30594,7 @@
       <w:pPr>
         <w:pStyle w:val="EstiloTablas"/>
       </w:pPr>
-      <w:bookmarkStart w:id="138" w:name="_Toc240230363"/>
+      <w:bookmarkStart w:id="138" w:name="_Toc241394746"/>
       <w:r>
         <w:t>Tabla 7: Consultar inventario</w:t>
       </w:r>
@@ -30300,6 +30631,7 @@
                 <w:b/>
                 <w:bCs/>
               </w:rPr>
+              <w:lastRenderedPageBreak/>
               <w:t>HU-03 — Consultar inventario</w:t>
             </w:r>
           </w:p>
@@ -30393,7 +30725,6 @@
               </w:numPr>
             </w:pPr>
             <w:r>
-              <w:lastRenderedPageBreak/>
               <w:t xml:space="preserve">Se muestra la cantidad disponible. </w:t>
             </w:r>
           </w:p>
@@ -30428,7 +30759,6 @@
           <w:sz w:val="18"/>
           <w:szCs w:val="18"/>
         </w:rPr>
-        <w:lastRenderedPageBreak/>
         <w:t>Referencia: autoría propia.</w:t>
       </w:r>
     </w:p>
@@ -30436,7 +30766,7 @@
       <w:pPr>
         <w:pStyle w:val="EstiloTablas"/>
       </w:pPr>
-      <w:bookmarkStart w:id="139" w:name="_Toc240230364"/>
+      <w:bookmarkStart w:id="139" w:name="_Toc241394747"/>
       <w:r>
         <w:t>Tabla 8: Registrar unidades de medida.</w:t>
       </w:r>
@@ -30668,7 +30998,7 @@
       <w:pPr>
         <w:pStyle w:val="EstiloTablas"/>
       </w:pPr>
-      <w:bookmarkStart w:id="140" w:name="_Toc240230365"/>
+      <w:bookmarkStart w:id="140" w:name="_Toc241394748"/>
       <w:r>
         <w:t>Tabla 9: Convertir unidades.</w:t>
       </w:r>
@@ -30751,6 +31081,7 @@
                 <w:b/>
                 <w:bCs/>
               </w:rPr>
+              <w:lastRenderedPageBreak/>
               <w:t>para</w:t>
             </w:r>
             <w:r>
@@ -30774,6 +31105,7 @@
                 <w:b/>
                 <w:bCs/>
               </w:rPr>
+              <w:lastRenderedPageBreak/>
               <w:t>Criterios de aceptación:</w:t>
             </w:r>
           </w:p>
@@ -30839,9 +31171,8 @@
       <w:pPr>
         <w:pStyle w:val="EstiloTablas"/>
       </w:pPr>
-      <w:bookmarkStart w:id="141" w:name="_Toc240230366"/>
-      <w:r>
-        <w:lastRenderedPageBreak/>
+      <w:bookmarkStart w:id="141" w:name="_Toc241394749"/>
+      <w:r>
         <w:t>Tabla 10: Registrar código de barras.</w:t>
       </w:r>
       <w:bookmarkEnd w:id="141"/>
@@ -31072,7 +31403,7 @@
       <w:pPr>
         <w:pStyle w:val="EstiloTablas"/>
       </w:pPr>
-      <w:bookmarkStart w:id="142" w:name="_Toc240230367"/>
+      <w:bookmarkStart w:id="142" w:name="_Toc241394750"/>
       <w:r>
         <w:t>Tabla 11: Buscar producto mediante código de barras.</w:t>
       </w:r>
@@ -31190,6 +31521,7 @@
               </w:numPr>
             </w:pPr>
             <w:r>
+              <w:lastRenderedPageBreak/>
               <w:t xml:space="preserve">El usuario puede ingresar o escanear un código. </w:t>
             </w:r>
           </w:p>
@@ -31236,6 +31568,7 @@
           <w:sz w:val="18"/>
           <w:szCs w:val="18"/>
         </w:rPr>
+        <w:lastRenderedPageBreak/>
         <w:t>Referencia: autoría propia.</w:t>
       </w:r>
     </w:p>
@@ -31253,7 +31586,7 @@
       <w:pPr>
         <w:pStyle w:val="EstiloTablas"/>
       </w:pPr>
-      <w:bookmarkStart w:id="143" w:name="_Toc240230368"/>
+      <w:bookmarkStart w:id="143" w:name="_Toc241394751"/>
       <w:r>
         <w:t>Tabla 12: Registrar paquetes</w:t>
       </w:r>
@@ -31358,7 +31691,6 @@
                 <w:lang w:val="es-CO"/>
                 <w14:ligatures w14:val="standardContextual"/>
               </w:rPr>
-              <w:lastRenderedPageBreak/>
               <w:t>quiero</w:t>
             </w:r>
             <w:r>
@@ -31421,7 +31753,6 @@
                 <w:b/>
                 <w:bCs/>
               </w:rPr>
-              <w:lastRenderedPageBreak/>
               <w:t>Criterios de aceptación:</w:t>
             </w:r>
           </w:p>
@@ -31492,7 +31823,7 @@
           <w:color w:val="auto"/>
         </w:rPr>
       </w:pPr>
-      <w:bookmarkStart w:id="144" w:name="_Toc240230369"/>
+      <w:bookmarkStart w:id="144" w:name="_Toc241394752"/>
       <w:r>
         <w:rPr>
           <w:rStyle w:val="Referenciasutil"/>
@@ -31639,6 +31970,7 @@
               </w:numPr>
             </w:pPr>
             <w:r>
+              <w:lastRenderedPageBreak/>
               <w:t>No permite vender más de lo disponible.</w:t>
             </w:r>
           </w:p>
@@ -31661,6 +31993,7 @@
           <w:sz w:val="18"/>
           <w:szCs w:val="18"/>
         </w:rPr>
+        <w:lastRenderedPageBreak/>
         <w:t>Referencia: autoría propia.</w:t>
       </w:r>
     </w:p>
@@ -31668,7 +32001,7 @@
       <w:pPr>
         <w:pStyle w:val="EstiloTablas"/>
       </w:pPr>
-      <w:bookmarkStart w:id="145" w:name="_Toc240230370"/>
+      <w:bookmarkStart w:id="145" w:name="_Toc241394753"/>
       <w:r>
         <w:t>Tabla 14: Registrar una venta</w:t>
       </w:r>
@@ -31786,7 +32119,6 @@
               </w:numPr>
             </w:pPr>
             <w:r>
-              <w:lastRenderedPageBreak/>
               <w:t xml:space="preserve">El usuario puede agregar productos. </w:t>
             </w:r>
           </w:p>
@@ -31845,7 +32177,6 @@
           <w:sz w:val="18"/>
           <w:szCs w:val="18"/>
         </w:rPr>
-        <w:lastRenderedPageBreak/>
         <w:t>Referencia: autoría propia.</w:t>
       </w:r>
     </w:p>
@@ -31853,9 +32184,11 @@
       <w:pPr>
         <w:pStyle w:val="EstiloTablas"/>
       </w:pPr>
+      <w:bookmarkStart w:id="146" w:name="_Toc241394754"/>
       <w:r>
         <w:t>Tabla 15: Aplicar descuentos.</w:t>
       </w:r>
+      <w:bookmarkEnd w:id="146"/>
     </w:p>
     <w:tbl>
       <w:tblPr>
@@ -32083,9 +32416,11 @@
       <w:pPr>
         <w:pStyle w:val="EstiloTablas"/>
       </w:pPr>
+      <w:bookmarkStart w:id="147" w:name="_Toc241394755"/>
       <w:r>
         <w:t>Tabla 16: Generar reporte PDF.</w:t>
       </w:r>
+      <w:bookmarkEnd w:id="147"/>
     </w:p>
     <w:tbl>
       <w:tblPr>
@@ -32118,6 +32453,7 @@
                 <w:b/>
                 <w:bCs/>
               </w:rPr>
+              <w:lastRenderedPageBreak/>
               <w:t>HU-1</w:t>
             </w:r>
             <w:r>
@@ -32376,7 +32712,6 @@
               </w:numPr>
             </w:pPr>
             <w:r>
-              <w:lastRenderedPageBreak/>
               <w:t>El total coincide con la venta.</w:t>
             </w:r>
           </w:p>
@@ -32399,7 +32734,6 @@
           <w:sz w:val="18"/>
           <w:szCs w:val="18"/>
         </w:rPr>
-        <w:lastRenderedPageBreak/>
         <w:t>Referencia: autoría propia.</w:t>
       </w:r>
     </w:p>
@@ -32407,9 +32741,11 @@
       <w:pPr>
         <w:pStyle w:val="EstiloTablas"/>
       </w:pPr>
+      <w:bookmarkStart w:id="148" w:name="_Toc241394756"/>
       <w:r>
         <w:t>Tabla 17: Alertar sobre stock bajo.</w:t>
       </w:r>
+      <w:bookmarkEnd w:id="148"/>
     </w:p>
     <w:tbl>
       <w:tblPr>
@@ -32590,9 +32926,11 @@
       <w:pPr>
         <w:pStyle w:val="EstiloTablas"/>
       </w:pPr>
+      <w:bookmarkStart w:id="149" w:name="_Toc241394757"/>
       <w:r>
         <w:t>Tabla 18: Alertar productos próximos a vencer.</w:t>
       </w:r>
+      <w:bookmarkEnd w:id="149"/>
     </w:p>
     <w:tbl>
       <w:tblPr>
@@ -32685,6 +33023,7 @@
                 <w:b/>
                 <w:bCs/>
               </w:rPr>
+              <w:lastRenderedPageBreak/>
               <w:t>para</w:t>
             </w:r>
             <w:r>
@@ -32708,6 +33047,7 @@
                 <w:b/>
                 <w:bCs/>
               </w:rPr>
+              <w:lastRenderedPageBreak/>
               <w:t>Criterios de aceptación:</w:t>
             </w:r>
           </w:p>
@@ -32803,10 +33143,11 @@
       <w:pPr>
         <w:pStyle w:val="EstiloTablas"/>
       </w:pPr>
-      <w:r>
-        <w:lastRenderedPageBreak/>
+      <w:bookmarkStart w:id="150" w:name="_Toc241394758"/>
+      <w:r>
         <w:t>Tabla 19: Inicio de sesión.</w:t>
       </w:r>
+      <w:bookmarkEnd w:id="150"/>
     </w:p>
     <w:tbl>
       <w:tblPr>
@@ -32994,12 +33335,14 @@
       <w:pPr>
         <w:pStyle w:val="EstiloTablas"/>
       </w:pPr>
+      <w:bookmarkStart w:id="151" w:name="_Toc241394759"/>
       <w:r>
         <w:t xml:space="preserve">Tabla 20: </w:t>
       </w:r>
       <w:r>
         <w:t>Registrar entrada mercancía.</w:t>
       </w:r>
+      <w:bookmarkEnd w:id="151"/>
     </w:p>
     <w:tbl>
       <w:tblPr>
@@ -33122,6 +33465,7 @@
                 <w:b/>
                 <w:bCs/>
               </w:rPr>
+              <w:lastRenderedPageBreak/>
               <w:t>Criterios de aceptación:</w:t>
             </w:r>
           </w:p>
@@ -33182,6 +33526,16 @@
         </w:rPr>
         <w:t>Referencia: autoría propia.</w:t>
       </w:r>
+    </w:p>
+    <w:p>
+      <w:pPr>
+        <w:pStyle w:val="EstiloTablas"/>
+      </w:pPr>
+      <w:bookmarkStart w:id="152" w:name="_Toc241394760"/>
+      <w:r>
+        <w:t>Tabla 21: Anular una venta.</w:t>
+      </w:r>
+      <w:bookmarkEnd w:id="152"/>
     </w:p>
     <w:tbl>
       <w:tblPr>
@@ -33284,11 +33638,7 @@
               <w:t>para</w:t>
             </w:r>
             <w:r>
-              <w:t xml:space="preserve"> corregir transacciones realizadas incorrectamente y recuperar las existencias </w:t>
-            </w:r>
-            <w:r>
-              <w:lastRenderedPageBreak/>
-              <w:t>correspondientes.</w:t>
+              <w:t xml:space="preserve"> corregir transacciones realizadas incorrectamente y recuperar las existencias correspondientes.</w:t>
             </w:r>
           </w:p>
           <w:p>
@@ -33314,7 +33664,6 @@
                 <w:b/>
                 <w:bCs/>
               </w:rPr>
-              <w:lastRenderedPageBreak/>
               <w:t>Criterios de aceptación:</w:t>
             </w:r>
           </w:p>
@@ -33369,13 +33718,472 @@
         </w:tc>
       </w:tr>
     </w:tbl>
+    <w:p>
+      <w:pPr>
+        <w:rPr>
+          <w:i/>
+          <w:iCs/>
+          <w:sz w:val="18"/>
+          <w:szCs w:val="18"/>
+        </w:rPr>
+      </w:pPr>
+      <w:r>
+        <w:rPr>
+          <w:i/>
+          <w:iCs/>
+          <w:sz w:val="18"/>
+          <w:szCs w:val="18"/>
+        </w:rPr>
+        <w:t>Referencia: autoría propia.</w:t>
+      </w:r>
+    </w:p>
+    <w:p>
+      <w:pPr>
+        <w:pStyle w:val="Ttulo2"/>
+      </w:pPr>
+      <w:r>
+        <w:t>D</w:t>
+      </w:r>
+      <w:r>
+        <w:t>iagrama</w:t>
+      </w:r>
+      <w:r>
+        <w:t xml:space="preserve"> E-R</w:t>
+      </w:r>
+    </w:p>
+    <w:p>
+      <w:pPr>
+        <w:pStyle w:val="Estilo2Ilustraciones"/>
+      </w:pPr>
+      <w:bookmarkStart w:id="153" w:name="_Toc241481021"/>
+      <w:r>
+        <w:t xml:space="preserve">Ilustración </w:t>
+      </w:r>
+      <w:r>
+        <w:t>3</w:t>
+      </w:r>
+      <w:r>
+        <w:t>: Diagrama E-R 1.0</w:t>
+      </w:r>
+      <w:bookmarkEnd w:id="153"/>
+    </w:p>
+    <w:p>
+      <w:r>
+        <w:rPr>
+          <w:noProof/>
+        </w:rPr>
+        <w:lastRenderedPageBreak/>
+        <w:drawing>
+          <wp:inline distT="0" distB="0" distL="0" distR="0" wp14:anchorId="0B736EC3" wp14:editId="1391BE47">
+            <wp:extent cx="5502797" cy="4051495"/>
+            <wp:effectExtent l="0" t="0" r="3175" b="6350"/>
+            <wp:docPr id="2" name="Imagen 2"/>
+            <wp:cNvGraphicFramePr>
+              <a:graphicFrameLocks xmlns:a="http://schemas.openxmlformats.org/drawingml/2006/main" noChangeAspect="1"/>
+            </wp:cNvGraphicFramePr>
+            <a:graphic xmlns:a="http://schemas.openxmlformats.org/drawingml/2006/main">
+              <a:graphicData uri="http://schemas.openxmlformats.org/drawingml/2006/picture">
+                <pic:pic xmlns:pic="http://schemas.openxmlformats.org/drawingml/2006/picture">
+                  <pic:nvPicPr>
+                    <pic:cNvPr id="0" name="Picture 1"/>
+                    <pic:cNvPicPr>
+                      <a:picLocks noChangeAspect="1" noChangeArrowheads="1"/>
+                    </pic:cNvPicPr>
+                  </pic:nvPicPr>
+                  <pic:blipFill>
+                    <a:blip r:embed="rId16">
+                      <a:extLst>
+                        <a:ext uri="{28A0092B-C50C-407E-A947-70E740481C1C}">
+                          <a14:useLocalDpi xmlns:a14="http://schemas.microsoft.com/office/drawing/2010/main" val="0"/>
+                        </a:ext>
+                      </a:extLst>
+                    </a:blip>
+                    <a:srcRect/>
+                    <a:stretch>
+                      <a:fillRect/>
+                    </a:stretch>
+                  </pic:blipFill>
+                  <pic:spPr bwMode="auto">
+                    <a:xfrm>
+                      <a:off x="0" y="0"/>
+                      <a:ext cx="5525636" cy="4068311"/>
+                    </a:xfrm>
+                    <a:prstGeom prst="rect">
+                      <a:avLst/>
+                    </a:prstGeom>
+                    <a:noFill/>
+                    <a:ln>
+                      <a:noFill/>
+                    </a:ln>
+                  </pic:spPr>
+                </pic:pic>
+              </a:graphicData>
+            </a:graphic>
+          </wp:inline>
+        </w:drawing>
+      </w:r>
+    </w:p>
+    <w:p>
+      <w:pPr>
+        <w:rPr>
+          <w:i/>
+          <w:iCs/>
+          <w:sz w:val="18"/>
+          <w:szCs w:val="18"/>
+        </w:rPr>
+      </w:pPr>
+      <w:r>
+        <w:rPr>
+          <w:i/>
+          <w:iCs/>
+          <w:sz w:val="18"/>
+          <w:szCs w:val="18"/>
+        </w:rPr>
+        <w:t>Referencia: autoría propia.</w:t>
+      </w:r>
+    </w:p>
+    <w:p>
+      <w:pPr>
+        <w:pStyle w:val="Estilo2Ilustraciones"/>
+      </w:pPr>
+      <w:bookmarkStart w:id="154" w:name="_Toc241481022"/>
+      <w:r>
+        <w:t xml:space="preserve">Ilustración </w:t>
+      </w:r>
+      <w:r>
+        <w:t>4</w:t>
+      </w:r>
+      <w:r>
+        <w:t>: Diagrama E-R 2.0</w:t>
+      </w:r>
+      <w:bookmarkEnd w:id="154"/>
+    </w:p>
+    <w:p>
+      <w:r>
+        <w:rPr>
+          <w:noProof/>
+        </w:rPr>
+        <w:lastRenderedPageBreak/>
+        <w:drawing>
+          <wp:inline distT="0" distB="0" distL="0" distR="0" wp14:anchorId="50CFC05C" wp14:editId="24FF74F2">
+            <wp:extent cx="5141741" cy="6365240"/>
+            <wp:effectExtent l="0" t="0" r="1905" b="0"/>
+            <wp:docPr id="4" name="Imagen 4" descr="PlantUML Diagram"/>
+            <wp:cNvGraphicFramePr>
+              <a:graphicFrameLocks xmlns:a="http://schemas.openxmlformats.org/drawingml/2006/main" noChangeAspect="1"/>
+            </wp:cNvGraphicFramePr>
+            <a:graphic xmlns:a="http://schemas.openxmlformats.org/drawingml/2006/main">
+              <a:graphicData uri="http://schemas.openxmlformats.org/drawingml/2006/picture">
+                <pic:pic xmlns:pic="http://schemas.openxmlformats.org/drawingml/2006/picture">
+                  <pic:nvPicPr>
+                    <pic:cNvPr id="0" name="Picture 3" descr="PlantUML Diagram"/>
+                    <pic:cNvPicPr>
+                      <a:picLocks noChangeAspect="1" noChangeArrowheads="1"/>
+                    </pic:cNvPicPr>
+                  </pic:nvPicPr>
+                  <pic:blipFill>
+                    <a:blip r:embed="rId17">
+                      <a:extLst>
+                        <a:ext uri="{28A0092B-C50C-407E-A947-70E740481C1C}">
+                          <a14:useLocalDpi xmlns:a14="http://schemas.microsoft.com/office/drawing/2010/main" val="0"/>
+                        </a:ext>
+                      </a:extLst>
+                    </a:blip>
+                    <a:srcRect/>
+                    <a:stretch>
+                      <a:fillRect/>
+                    </a:stretch>
+                  </pic:blipFill>
+                  <pic:spPr bwMode="auto">
+                    <a:xfrm>
+                      <a:off x="0" y="0"/>
+                      <a:ext cx="5191594" cy="6426956"/>
+                    </a:xfrm>
+                    <a:prstGeom prst="rect">
+                      <a:avLst/>
+                    </a:prstGeom>
+                    <a:noFill/>
+                    <a:ln>
+                      <a:noFill/>
+                    </a:ln>
+                  </pic:spPr>
+                </pic:pic>
+              </a:graphicData>
+            </a:graphic>
+          </wp:inline>
+        </w:drawing>
+      </w:r>
+    </w:p>
+    <w:p>
+      <w:pPr>
+        <w:rPr>
+          <w:i/>
+          <w:iCs/>
+          <w:sz w:val="18"/>
+          <w:szCs w:val="18"/>
+        </w:rPr>
+      </w:pPr>
+      <w:r>
+        <w:rPr>
+          <w:i/>
+          <w:iCs/>
+          <w:sz w:val="18"/>
+          <w:szCs w:val="18"/>
+        </w:rPr>
+        <w:t>Referencia: autoría propia.</w:t>
+      </w:r>
+    </w:p>
+    <w:p>
+      <w:pPr>
+        <w:rPr>
+          <w:i/>
+          <w:iCs/>
+          <w:sz w:val="18"/>
+          <w:szCs w:val="18"/>
+        </w:rPr>
+      </w:pPr>
+    </w:p>
+    <w:p>
+      <w:pPr>
+        <w:rPr>
+          <w:i/>
+          <w:iCs/>
+          <w:sz w:val="18"/>
+          <w:szCs w:val="18"/>
+        </w:rPr>
+      </w:pPr>
+    </w:p>
     <w:p/>
     <w:p>
       <w:pPr>
+        <w:pStyle w:val="Ttulo2"/>
+      </w:pPr>
+      <w:r>
+        <w:t>Diagrama de casos de uso</w:t>
+      </w:r>
+    </w:p>
+    <w:p>
+      <w:pPr>
+        <w:pStyle w:val="Estilo2Ilustraciones"/>
+      </w:pPr>
+      <w:bookmarkStart w:id="155" w:name="_Toc241481023"/>
+      <w:r>
+        <w:t xml:space="preserve">Ilustración </w:t>
+      </w:r>
+      <w:r>
+        <w:t>5</w:t>
+      </w:r>
+      <w:r>
+        <w:t>: Diagrama de casos de uso</w:t>
+      </w:r>
+      <w:bookmarkEnd w:id="155"/>
+    </w:p>
+    <w:p>
+      <w:r>
+        <w:rPr>
+          <w:noProof/>
+        </w:rPr>
+        <w:lastRenderedPageBreak/>
+        <w:drawing>
+          <wp:inline distT="0" distB="0" distL="0" distR="0" wp14:anchorId="19F36F00" wp14:editId="6E5FBD70">
+            <wp:extent cx="4305782" cy="6165215"/>
+            <wp:effectExtent l="0" t="0" r="0" b="6985"/>
+            <wp:docPr id="6" name="Imagen 6" descr="PlantUML Diagram"/>
+            <wp:cNvGraphicFramePr>
+              <a:graphicFrameLocks xmlns:a="http://schemas.openxmlformats.org/drawingml/2006/main" noChangeAspect="1"/>
+            </wp:cNvGraphicFramePr>
+            <a:graphic xmlns:a="http://schemas.openxmlformats.org/drawingml/2006/main">
+              <a:graphicData uri="http://schemas.openxmlformats.org/drawingml/2006/picture">
+                <pic:pic xmlns:pic="http://schemas.openxmlformats.org/drawingml/2006/picture">
+                  <pic:nvPicPr>
+                    <pic:cNvPr id="0" name="Picture 5" descr="PlantUML Diagram"/>
+                    <pic:cNvPicPr>
+                      <a:picLocks noChangeAspect="1" noChangeArrowheads="1"/>
+                    </pic:cNvPicPr>
+                  </pic:nvPicPr>
+                  <pic:blipFill>
+                    <a:blip r:embed="rId18">
+                      <a:extLst>
+                        <a:ext uri="{28A0092B-C50C-407E-A947-70E740481C1C}">
+                          <a14:useLocalDpi xmlns:a14="http://schemas.microsoft.com/office/drawing/2010/main" val="0"/>
+                        </a:ext>
+                      </a:extLst>
+                    </a:blip>
+                    <a:srcRect/>
+                    <a:stretch>
+                      <a:fillRect/>
+                    </a:stretch>
+                  </pic:blipFill>
+                  <pic:spPr bwMode="auto">
+                    <a:xfrm>
+                      <a:off x="0" y="0"/>
+                      <a:ext cx="4310790" cy="6172385"/>
+                    </a:xfrm>
+                    <a:prstGeom prst="rect">
+                      <a:avLst/>
+                    </a:prstGeom>
+                    <a:noFill/>
+                    <a:ln>
+                      <a:noFill/>
+                    </a:ln>
+                  </pic:spPr>
+                </pic:pic>
+              </a:graphicData>
+            </a:graphic>
+          </wp:inline>
+        </w:drawing>
+      </w:r>
+    </w:p>
+    <w:p>
+      <w:pPr>
+        <w:rPr>
+          <w:i/>
+          <w:iCs/>
+          <w:sz w:val="18"/>
+          <w:szCs w:val="18"/>
+        </w:rPr>
+      </w:pPr>
+      <w:r>
+        <w:rPr>
+          <w:i/>
+          <w:iCs/>
+          <w:sz w:val="18"/>
+          <w:szCs w:val="18"/>
+        </w:rPr>
+        <w:t>Referencia: autoría propia.</w:t>
+      </w:r>
+    </w:p>
+    <w:p>
+      <w:pPr>
+        <w:pStyle w:val="Ttulo2"/>
+      </w:pPr>
+      <w:r>
+        <w:t>Diagrama de clases</w:t>
+      </w:r>
+    </w:p>
+    <w:p>
+      <w:pPr>
+        <w:pStyle w:val="Ttulo2"/>
+      </w:pPr>
+      <w:r>
+        <w:t>Arquitectura del sistema</w:t>
+      </w:r>
+    </w:p>
+    <w:p>
+      <w:r>
+        <w:t xml:space="preserve">El sistema está estructurado bajo el patrón arquitectónico Modelo-Vista-Controlador (MVC), con el propósito de separar las responsabilidades relacionadas con la presentación, el procesamiento de las operaciones y la persistencia de los datos. Esta organización permite </w:t>
+      </w:r>
+      <w:r>
+        <w:lastRenderedPageBreak/>
+        <w:t>mantener un bajo acoplamiento entre los componentes y facilita el mantenimiento y evolución del sistema.</w:t>
+      </w:r>
+    </w:p>
+    <w:p>
+      <w:pPr>
+        <w:pStyle w:val="Ttulo3"/>
+        <w:rPr>
+          <w:lang w:val="es-CO"/>
+        </w:rPr>
+      </w:pPr>
+      <w:proofErr w:type="spellStart"/>
+      <w:r>
+        <w:rPr>
+          <w:lang w:val="es-CO"/>
+        </w:rPr>
+        <w:t>Frontend</w:t>
+      </w:r>
+      <w:proofErr w:type="spellEnd"/>
+    </w:p>
+    <w:p>
+      <w:pPr>
+        <w:rPr>
+          <w:lang w:val="es-CO"/>
+        </w:rPr>
+      </w:pPr>
+      <w:r>
+        <w:t xml:space="preserve">La Vista está implementada mediante archivos FXML, utilizados para definir la estructura y composición de las interfaces gráficas desarrolladas con </w:t>
+      </w:r>
+      <w:proofErr w:type="spellStart"/>
+      <w:r>
+        <w:t>JavaFX</w:t>
+      </w:r>
+      <w:proofErr w:type="spellEnd"/>
+      <w:r>
+        <w:t>. La apariencia y el diseño visual de los componentes se gestionan mediante archivos CSS, permitiendo establecer estilos, colores, tamaños, tipografías y demás características visuales de la aplicación.</w:t>
+      </w:r>
+    </w:p>
+    <w:p>
+      <w:r>
+        <w:t xml:space="preserve">Cada vista se encuentra asociada a una clase Controlador, encargada de gestionar los eventos generados por el usuario, validar las entradas y coordinar las operaciones requeridas por la aplicación. Los controladores funcionan como intermediarios entre la interfaz gráfica y el </w:t>
+      </w:r>
+      <w:proofErr w:type="spellStart"/>
+      <w:r>
+        <w:t>backend</w:t>
+      </w:r>
+      <w:proofErr w:type="spellEnd"/>
+      <w:r>
+        <w:t>, enviando las solicitudes correspondientes y recibiendo los resultados para actualizar la información presentada al usuario.</w:t>
+      </w:r>
+    </w:p>
+    <w:p>
+      <w:pPr>
+        <w:pStyle w:val="Ttulo3"/>
+      </w:pPr>
+      <w:proofErr w:type="spellStart"/>
+      <w:r>
+        <w:t>Backend</w:t>
+      </w:r>
+      <w:proofErr w:type="spellEnd"/>
+    </w:p>
+    <w:p>
+      <w:pPr>
+        <w:rPr>
+          <w:lang w:val="es-CO"/>
+        </w:rPr>
+      </w:pPr>
+      <w:r>
+        <w:t xml:space="preserve">El </w:t>
+      </w:r>
+      <w:proofErr w:type="spellStart"/>
+      <w:r>
+        <w:t>backend</w:t>
+      </w:r>
+      <w:proofErr w:type="spellEnd"/>
+      <w:r>
+        <w:t xml:space="preserve"> está compuesto principalmente por las clases Repositorio y Modelo. Los repositorios encapsulan la lógica de acceso y persistencia de datos, estableciendo la comunicación con la base de datos SQLite mediante las operaciones SQL correspondientes.</w:t>
+      </w:r>
+    </w:p>
+    <w:p>
+      <w:r>
+        <w:t>Los registros obtenidos desde la base de datos son procesados y transformados en instancias de las clases que conforman el Modelo, permitiendo representar la información mediante objetos dentro de la aplicación. Para las operaciones de inserción, actualización y eliminación, los repositorios reciben los objetos del modelo y ejecutan las operaciones correspondientes sobre SQLite.</w:t>
+      </w:r>
+    </w:p>
+    <w:p>
+      <w:r>
+        <w:t xml:space="preserve">De esta manera, el flujo de información inicia en la interfaz gráfica, donde el usuario realiza una acción que es gestionada por el controlador. Posteriormente, el controlador solicita al </w:t>
+      </w:r>
+      <w:r>
+        <w:lastRenderedPageBreak/>
+        <w:t>repositorio la operación correspondiente sobre la base de datos. Los resultados obtenidos son convertidos en objetos del modelo y retornados al controlador para finalmente actualizar la información presentada en la vista.</w:t>
+      </w:r>
+    </w:p>
+    <w:p>
+      <w:r>
+        <w:t>Esta estructura permite mantener separadas las responsabilidades de presentación, procesamiento y persistencia, facilitando el mantenimiento, las pruebas y futuras modificaciones del sistema.</w:t>
+      </w:r>
+    </w:p>
+    <w:p>
+      <w:pPr>
+        <w:pStyle w:val="Ttulo2"/>
+      </w:pPr>
+      <w:r>
+        <w:t>Git Hub</w:t>
+      </w:r>
+    </w:p>
+    <w:p>
+      <w:pPr>
         <w:pStyle w:val="Ttulo1"/>
       </w:pPr>
-      <w:bookmarkStart w:id="146" w:name="4.1_Costos"/>
-      <w:bookmarkEnd w:id="146"/>
       <w:r>
         <w:t>Resultados obtenidos</w:t>
       </w:r>
@@ -33401,7 +34209,7 @@
         <w:br w:type="page"/>
       </w:r>
     </w:p>
-    <w:bookmarkStart w:id="147" w:name="_Toc228388887" w:displacedByCustomXml="next"/>
+    <w:bookmarkStart w:id="156" w:name="_Toc228388887" w:displacedByCustomXml="next"/>
     <w:sdt>
       <w:sdtPr>
         <w:rPr>
@@ -33427,7 +34235,7 @@
           <w:r>
             <w:t>Referencias</w:t>
           </w:r>
-          <w:bookmarkEnd w:id="147"/>
+          <w:bookmarkEnd w:id="156"/>
         </w:p>
         <w:sdt>
           <w:sdtPr>
@@ -33473,7 +34281,7 @@
                 </w:rPr>
                 <w:t xml:space="preserve">. Obtenido de Todo lo que tienes que saber sobre el PDF: </w:t>
               </w:r>
-              <w:hyperlink r:id="rId16" w:history="1">
+              <w:hyperlink r:id="rId19" w:history="1">
                 <w:r>
                   <w:rPr>
                     <w:rStyle w:val="Hipervnculo"/>
@@ -33511,7 +34319,7 @@
                 </w:rPr>
                 <w:t xml:space="preserve">. Obtenido de Software de gestión para contadores y pymes: </w:t>
               </w:r>
-              <w:hyperlink r:id="rId17" w:history="1">
+              <w:hyperlink r:id="rId20" w:history="1">
                 <w:r>
                   <w:rPr>
                     <w:rStyle w:val="Hipervnculo"/>
@@ -33549,7 +34357,7 @@
                 </w:rPr>
                 <w:t xml:space="preserve">. Obtenido de Diferencias entre aplicaciones en Local y en Cloud: </w:t>
               </w:r>
-              <w:hyperlink r:id="rId18" w:history="1">
+              <w:hyperlink r:id="rId21" w:history="1">
                 <w:r>
                   <w:rPr>
                     <w:rStyle w:val="Hipervnculo"/>
@@ -33587,7 +34395,7 @@
                 </w:rPr>
                 <w:t>. Obtenido de ¿Qué es un sistema de inventario informatizado?:</w:t>
               </w:r>
-              <w:hyperlink r:id="rId19" w:history="1">
+              <w:hyperlink r:id="rId22" w:history="1">
                 <w:r>
                   <w:rPr>
                     <w:rStyle w:val="Hipervnculo"/>
@@ -33625,7 +34433,7 @@
                 </w:rPr>
                 <w:t xml:space="preserve">. Obtenido de ¿Qué es CSS?: </w:t>
               </w:r>
-              <w:hyperlink r:id="rId20" w:history="1">
+              <w:hyperlink r:id="rId23" w:history="1">
                 <w:r>
                   <w:rPr>
                     <w:rStyle w:val="Hipervnculo"/>
@@ -33663,7 +34471,7 @@
                 </w:rPr>
                 <w:t xml:space="preserve">. Obtenido de </w:t>
               </w:r>
-              <w:hyperlink r:id="rId21" w:history="1">
+              <w:hyperlink r:id="rId24" w:history="1">
                 <w:r>
                   <w:rPr>
                     <w:rStyle w:val="Hipervnculo"/>
@@ -33730,7 +34538,7 @@
                 </w:rPr>
                 <w:t xml:space="preserve">. Obtenido de Acerca de GitHub y Git: </w:t>
               </w:r>
-              <w:hyperlink r:id="rId22" w:history="1">
+              <w:hyperlink r:id="rId25" w:history="1">
                 <w:r>
                   <w:rPr>
                     <w:rStyle w:val="Hipervnculo"/>
@@ -33768,7 +34576,7 @@
                 </w:rPr>
                 <w:t xml:space="preserve">. Obtenido de Máquina virtual Java: </w:t>
               </w:r>
-              <w:hyperlink r:id="rId23" w:history="1">
+              <w:hyperlink r:id="rId26" w:history="1">
                 <w:r>
                   <w:rPr>
                     <w:rStyle w:val="Hipervnculo"/>
@@ -33806,7 +34614,7 @@
                 </w:rPr>
                 <w:t xml:space="preserve">. Obtenido de ¿Qué es una base de datos relacional?: </w:t>
               </w:r>
-              <w:hyperlink r:id="rId24" w:history="1">
+              <w:hyperlink r:id="rId27" w:history="1">
                 <w:r>
                   <w:rPr>
                     <w:rStyle w:val="Hipervnculo"/>
@@ -33844,7 +34652,7 @@
                 </w:rPr>
                 <w:t xml:space="preserve">. Obtenido de Simple Inventory Management Software.: </w:t>
               </w:r>
-              <w:hyperlink r:id="rId25" w:history="1">
+              <w:hyperlink r:id="rId28" w:history="1">
                 <w:r>
                   <w:rPr>
                     <w:rStyle w:val="Hipervnculo"/>
@@ -33882,7 +34690,7 @@
                 </w:rPr>
                 <w:t xml:space="preserve">. Obtenido de JavaFX: </w:t>
               </w:r>
-              <w:hyperlink r:id="rId26" w:history="1">
+              <w:hyperlink r:id="rId29" w:history="1">
                 <w:r>
                   <w:rPr>
                     <w:rStyle w:val="Hipervnculo"/>
@@ -34036,7 +34844,7 @@
                 </w:rPr>
                 <w:t xml:space="preserve">. Obtenido de ¿Qué es Java?: </w:t>
               </w:r>
-              <w:hyperlink r:id="rId27" w:history="1">
+              <w:hyperlink r:id="rId30" w:history="1">
                 <w:r>
                   <w:rPr>
                     <w:rStyle w:val="Hipervnculo"/>
@@ -34074,7 +34882,7 @@
                 </w:rPr>
                 <w:t xml:space="preserve">. Obtenido de Glosario de MDN Web Docs: </w:t>
               </w:r>
-              <w:hyperlink r:id="rId28" w:history="1">
+              <w:hyperlink r:id="rId31" w:history="1">
                 <w:r>
                   <w:rPr>
                     <w:rStyle w:val="Hipervnculo"/>
@@ -34112,7 +34920,7 @@
                 </w:rPr>
                 <w:t xml:space="preserve">. Obtenido de Documentación de Odoo: </w:t>
               </w:r>
-              <w:hyperlink r:id="rId29" w:history="1">
+              <w:hyperlink r:id="rId32" w:history="1">
                 <w:r>
                   <w:rPr>
                     <w:rStyle w:val="Hipervnculo"/>
@@ -34150,7 +34958,7 @@
                 </w:rPr>
                 <w:t xml:space="preserve">. Obtenido de SciELO: </w:t>
               </w:r>
-              <w:hyperlink r:id="rId30" w:history="1">
+              <w:hyperlink r:id="rId33" w:history="1">
                 <w:r>
                   <w:rPr>
                     <w:rStyle w:val="Hipervnculo"/>
@@ -34188,7 +34996,7 @@
                 </w:rPr>
                 <w:t xml:space="preserve">. Obtenido de The World's Most Advanced Open Source Relational Database: </w:t>
               </w:r>
-              <w:hyperlink r:id="rId31" w:history="1">
+              <w:hyperlink r:id="rId34" w:history="1">
                 <w:r>
                   <w:rPr>
                     <w:rStyle w:val="Hipervnculo"/>
@@ -34262,7 +35070,7 @@
                 <w:lastRenderedPageBreak/>
                 <w:t>funciona:</w:t>
               </w:r>
-              <w:hyperlink r:id="rId32" w:history="1">
+              <w:hyperlink r:id="rId35" w:history="1">
                 <w:r>
                   <w:rPr>
                     <w:rStyle w:val="Hipervnculo"/>
@@ -34329,7 +35137,7 @@
                 </w:rPr>
                 <w:t xml:space="preserve">. Obtenido de Sortly: </w:t>
               </w:r>
-              <w:hyperlink r:id="rId33" w:history="1">
+              <w:hyperlink r:id="rId36" w:history="1">
                 <w:r>
                   <w:rPr>
                     <w:rStyle w:val="Hipervnculo"/>
@@ -34367,7 +35175,7 @@
                 </w:rPr>
                 <w:t xml:space="preserve">. Obtenido de Small. Fast. Reliable.: </w:t>
               </w:r>
-              <w:hyperlink r:id="rId34" w:history="1">
+              <w:hyperlink r:id="rId37" w:history="1">
                 <w:r>
                   <w:rPr>
                     <w:rStyle w:val="Hipervnculo"/>
@@ -34434,7 +35242,7 @@
                 </w:rPr>
                 <w:t xml:space="preserve">. Obtenido de IBM 305 RAMAC: </w:t>
               </w:r>
-              <w:hyperlink r:id="rId35" w:history="1">
+              <w:hyperlink r:id="rId38" w:history="1">
                 <w:r>
                   <w:rPr>
                     <w:rStyle w:val="Hipervnculo"/>
@@ -34458,7 +35266,7 @@
       </w:sdtContent>
     </w:sdt>
     <w:sectPr>
-      <w:footerReference w:type="default" r:id="rId36"/>
+      <w:footerReference w:type="default" r:id="rId39"/>
       <w:type w:val="continuous"/>
       <w:pgSz w:w="12240" w:h="15840" w:code="1"/>
       <w:pgMar w:top="1457" w:right="1457" w:bottom="1457" w:left="1457" w:header="471" w:footer="0" w:gutter="0"/>
@@ -34639,7 +35447,7 @@
         <w:sz w:val="20"/>
       </w:rPr>
       <w:drawing>
-        <wp:anchor distT="0" distB="0" distL="0" distR="0" simplePos="0" relativeHeight="251657216" behindDoc="1" locked="0" layoutInCell="1" allowOverlap="1" wp14:anchorId="3EE55BCA" wp14:editId="256E5879">
+        <wp:anchor distT="0" distB="0" distL="0" distR="0" simplePos="0" relativeHeight="251656192" behindDoc="1" locked="0" layoutInCell="1" allowOverlap="1" wp14:anchorId="3EE55BCA" wp14:editId="256E5879">
           <wp:simplePos x="0" y="0"/>
           <wp:positionH relativeFrom="page">
             <wp:posOffset>-55</wp:posOffset>
@@ -34650,7 +35458,7 @@
           <wp:extent cx="7772400" cy="810857"/>
           <wp:effectExtent l="0" t="0" r="0" b="8890"/>
           <wp:wrapNone/>
-          <wp:docPr id="31" name="Image 4"/>
+          <wp:docPr id="9" name="Image 4"/>
           <wp:cNvGraphicFramePr>
             <a:graphicFrameLocks xmlns:a="http://schemas.openxmlformats.org/drawingml/2006/main"/>
           </wp:cNvGraphicFramePr>
@@ -34696,7 +35504,7 @@
       <mc:AlternateContent>
         <mc:Choice Requires="wps">
           <w:drawing>
-            <wp:anchor distT="0" distB="0" distL="0" distR="0" simplePos="0" relativeHeight="251659264" behindDoc="1" locked="0" layoutInCell="1" allowOverlap="1" wp14:anchorId="78E291CD" wp14:editId="27006946">
+            <wp:anchor distT="0" distB="0" distL="0" distR="0" simplePos="0" relativeHeight="251658240" behindDoc="1" locked="0" layoutInCell="1" allowOverlap="1" wp14:anchorId="78E291CD" wp14:editId="27006946">
               <wp:simplePos x="0" y="0"/>
               <wp:positionH relativeFrom="page">
                 <wp:posOffset>6483096</wp:posOffset>
@@ -34782,7 +35590,7 @@
               <v:stroke joinstyle="miter"/>
               <v:path gradientshapeok="t" o:connecttype="rect"/>
             </v:shapetype>
-            <v:shape id="Textbox 5" o:spid="_x0000_s1027" type="#_x0000_t202" style="position:absolute;left:0;text-align:left;margin-left:510.5pt;margin-top:70.35pt;width:17pt;height:15.3pt;z-index:-251657216;visibility:visible;mso-wrap-style:square;mso-wrap-distance-left:0;mso-wrap-distance-top:0;mso-wrap-distance-right:0;mso-wrap-distance-bottom:0;mso-position-horizontal:absolute;mso-position-horizontal-relative:page;mso-position-vertical:absolute;mso-position-vertical-relative:page;v-text-anchor:top" o:gfxdata="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" filled="f" stroked="f">
+            <v:shape id="Textbox 5" o:spid="_x0000_s1027" type="#_x0000_t202" style="position:absolute;left:0;text-align:left;margin-left:510.5pt;margin-top:70.35pt;width:17pt;height:15.3pt;z-index:-251658240;visibility:visible;mso-wrap-style:square;mso-wrap-distance-left:0;mso-wrap-distance-top:0;mso-wrap-distance-right:0;mso-wrap-distance-bottom:0;mso-position-horizontal:absolute;mso-position-horizontal-relative:page;mso-position-vertical:absolute;mso-position-vertical-relative:page;v-text-anchor:top" o:gfxdata="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" filled="f" stroked="f">
               <v:textbox inset="0,0,0,0">
                 <w:txbxContent>
                   <w:p>
@@ -36193,6 +37001,119 @@
     </w:lvl>
   </w:abstractNum>
   <w:abstractNum w:abstractNumId="11" w15:restartNumberingAfterBreak="0">
+    <w:nsid w:val="19DE0104"/>
+    <w:multiLevelType w:val="hybridMultilevel"/>
+    <w:tmpl w:val="6BD8CCA4"/>
+    <w:lvl w:ilvl="0" w:tplc="240A0001">
+      <w:start w:val="1"/>
+      <w:numFmt w:val="bullet"/>
+      <w:lvlText w:val=""/>
+      <w:lvlJc w:val="left"/>
+      <w:pPr>
+        <w:ind w:left="1440" w:hanging="360"/>
+      </w:pPr>
+      <w:rPr>
+        <w:rFonts w:ascii="Symbol" w:hAnsi="Symbol" w:hint="default"/>
+      </w:rPr>
+    </w:lvl>
+    <w:lvl w:ilvl="1" w:tplc="240A0003" w:tentative="1">
+      <w:start w:val="1"/>
+      <w:numFmt w:val="bullet"/>
+      <w:lvlText w:val="o"/>
+      <w:lvlJc w:val="left"/>
+      <w:pPr>
+        <w:ind w:left="2160" w:hanging="360"/>
+      </w:pPr>
+      <w:rPr>
+        <w:rFonts w:ascii="Courier New" w:hAnsi="Courier New" w:cs="Courier New" w:hint="default"/>
+      </w:rPr>
+    </w:lvl>
+    <w:lvl w:ilvl="2" w:tplc="240A0005" w:tentative="1">
+      <w:start w:val="1"/>
+      <w:numFmt w:val="bullet"/>
+      <w:lvlText w:val=""/>
+      <w:lvlJc w:val="left"/>
+      <w:pPr>
+        <w:ind w:left="2880" w:hanging="360"/>
+      </w:pPr>
+      <w:rPr>
+        <w:rFonts w:ascii="Wingdings" w:hAnsi="Wingdings" w:hint="default"/>
+      </w:rPr>
+    </w:lvl>
+    <w:lvl w:ilvl="3" w:tplc="240A0001" w:tentative="1">
+      <w:start w:val="1"/>
+      <w:numFmt w:val="bullet"/>
+      <w:lvlText w:val=""/>
+      <w:lvlJc w:val="left"/>
+      <w:pPr>
+        <w:ind w:left="3600" w:hanging="360"/>
+      </w:pPr>
+      <w:rPr>
+        <w:rFonts w:ascii="Symbol" w:hAnsi="Symbol" w:hint="default"/>
+      </w:rPr>
+    </w:lvl>
+    <w:lvl w:ilvl="4" w:tplc="240A0003" w:tentative="1">
+      <w:start w:val="1"/>
+      <w:numFmt w:val="bullet"/>
+      <w:lvlText w:val="o"/>
+      <w:lvlJc w:val="left"/>
+      <w:pPr>
+        <w:ind w:left="4320" w:hanging="360"/>
+      </w:pPr>
+      <w:rPr>
+        <w:rFonts w:ascii="Courier New" w:hAnsi="Courier New" w:cs="Courier New" w:hint="default"/>
+      </w:rPr>
+    </w:lvl>
+    <w:lvl w:ilvl="5" w:tplc="240A0005" w:tentative="1">
+      <w:start w:val="1"/>
+      <w:numFmt w:val="bullet"/>
+      <w:lvlText w:val=""/>
+      <w:lvlJc w:val="left"/>
+      <w:pPr>
+        <w:ind w:left="5040" w:hanging="360"/>
+      </w:pPr>
+      <w:rPr>
+        <w:rFonts w:ascii="Wingdings" w:hAnsi="Wingdings" w:hint="default"/>
+      </w:rPr>
+    </w:lvl>
+    <w:lvl w:ilvl="6" w:tplc="240A0001" w:tentative="1">
+      <w:start w:val="1"/>
+      <w:numFmt w:val="bullet"/>
+      <w:lvlText w:val=""/>
+      <w:lvlJc w:val="left"/>
+      <w:pPr>
+        <w:ind w:left="5760" w:hanging="360"/>
+      </w:pPr>
+      <w:rPr>
+        <w:rFonts w:ascii="Symbol" w:hAnsi="Symbol" w:hint="default"/>
+      </w:rPr>
+    </w:lvl>
+    <w:lvl w:ilvl="7" w:tplc="240A0003" w:tentative="1">
+      <w:start w:val="1"/>
+      <w:numFmt w:val="bullet"/>
+      <w:lvlText w:val="o"/>
+      <w:lvlJc w:val="left"/>
+      <w:pPr>
+        <w:ind w:left="6480" w:hanging="360"/>
+      </w:pPr>
+      <w:rPr>
+        <w:rFonts w:ascii="Courier New" w:hAnsi="Courier New" w:cs="Courier New" w:hint="default"/>
+      </w:rPr>
+    </w:lvl>
+    <w:lvl w:ilvl="8" w:tplc="240A0005" w:tentative="1">
+      <w:start w:val="1"/>
+      <w:numFmt w:val="bullet"/>
+      <w:lvlText w:val=""/>
+      <w:lvlJc w:val="left"/>
+      <w:pPr>
+        <w:ind w:left="7200" w:hanging="360"/>
+      </w:pPr>
+      <w:rPr>
+        <w:rFonts w:ascii="Wingdings" w:hAnsi="Wingdings" w:hint="default"/>
+      </w:rPr>
+    </w:lvl>
+  </w:abstractNum>
+  <w:abstractNum w:abstractNumId="12" w15:restartNumberingAfterBreak="0">
     <w:nsid w:val="1EC51264"/>
     <w:multiLevelType w:val="hybridMultilevel"/>
     <w:tmpl w:val="73483076"/>
@@ -36305,7 +37226,7 @@
       </w:rPr>
     </w:lvl>
   </w:abstractNum>
-  <w:abstractNum w:abstractNumId="12" w15:restartNumberingAfterBreak="0">
+  <w:abstractNum w:abstractNumId="13" w15:restartNumberingAfterBreak="0">
     <w:nsid w:val="1F2F7590"/>
     <w:multiLevelType w:val="hybridMultilevel"/>
     <w:tmpl w:val="E70EB888"/>
@@ -36418,7 +37339,7 @@
       </w:rPr>
     </w:lvl>
   </w:abstractNum>
-  <w:abstractNum w:abstractNumId="13" w15:restartNumberingAfterBreak="0">
+  <w:abstractNum w:abstractNumId="14" w15:restartNumberingAfterBreak="0">
     <w:nsid w:val="208E1D18"/>
     <w:multiLevelType w:val="hybridMultilevel"/>
     <w:tmpl w:val="1BE6A602"/>
@@ -36531,7 +37452,7 @@
       </w:rPr>
     </w:lvl>
   </w:abstractNum>
-  <w:abstractNum w:abstractNumId="14" w15:restartNumberingAfterBreak="0">
+  <w:abstractNum w:abstractNumId="15" w15:restartNumberingAfterBreak="0">
     <w:nsid w:val="23E83CE8"/>
     <w:multiLevelType w:val="hybridMultilevel"/>
     <w:tmpl w:val="7F0448F6"/>
@@ -36660,7 +37581,7 @@
       </w:rPr>
     </w:lvl>
   </w:abstractNum>
-  <w:abstractNum w:abstractNumId="15" w15:restartNumberingAfterBreak="0">
+  <w:abstractNum w:abstractNumId="16" w15:restartNumberingAfterBreak="0">
     <w:nsid w:val="25E501E7"/>
     <w:multiLevelType w:val="multilevel"/>
     <w:tmpl w:val="B2FAC8D2"/>
@@ -36755,7 +37676,7 @@
       </w:pPr>
     </w:lvl>
   </w:abstractNum>
-  <w:abstractNum w:abstractNumId="16" w15:restartNumberingAfterBreak="0">
+  <w:abstractNum w:abstractNumId="17" w15:restartNumberingAfterBreak="0">
     <w:nsid w:val="2C35345E"/>
     <w:multiLevelType w:val="hybridMultilevel"/>
     <w:tmpl w:val="4CB4F0FE"/>
@@ -36876,7 +37797,7 @@
       </w:rPr>
     </w:lvl>
   </w:abstractNum>
-  <w:abstractNum w:abstractNumId="17" w15:restartNumberingAfterBreak="0">
+  <w:abstractNum w:abstractNumId="18" w15:restartNumberingAfterBreak="0">
     <w:nsid w:val="2F8F2A72"/>
     <w:multiLevelType w:val="hybridMultilevel"/>
     <w:tmpl w:val="06EAB4F8"/>
@@ -36997,7 +37918,7 @@
       </w:rPr>
     </w:lvl>
   </w:abstractNum>
-  <w:abstractNum w:abstractNumId="18" w15:restartNumberingAfterBreak="0">
+  <w:abstractNum w:abstractNumId="19" w15:restartNumberingAfterBreak="0">
     <w:nsid w:val="32DB2B1A"/>
     <w:multiLevelType w:val="hybridMultilevel"/>
     <w:tmpl w:val="64CECDDE"/>
@@ -37119,7 +38040,7 @@
       </w:rPr>
     </w:lvl>
   </w:abstractNum>
-  <w:abstractNum w:abstractNumId="19" w15:restartNumberingAfterBreak="0">
+  <w:abstractNum w:abstractNumId="20" w15:restartNumberingAfterBreak="0">
     <w:nsid w:val="348047CA"/>
     <w:multiLevelType w:val="multilevel"/>
     <w:tmpl w:val="0E6A784A"/>
@@ -37268,7 +38189,7 @@
       </w:rPr>
     </w:lvl>
   </w:abstractNum>
-  <w:abstractNum w:abstractNumId="20" w15:restartNumberingAfterBreak="0">
+  <w:abstractNum w:abstractNumId="21" w15:restartNumberingAfterBreak="0">
     <w:nsid w:val="354F5387"/>
     <w:multiLevelType w:val="hybridMultilevel"/>
     <w:tmpl w:val="B29C7B6A"/>
@@ -37381,7 +38302,7 @@
       </w:rPr>
     </w:lvl>
   </w:abstractNum>
-  <w:abstractNum w:abstractNumId="21" w15:restartNumberingAfterBreak="0">
+  <w:abstractNum w:abstractNumId="22" w15:restartNumberingAfterBreak="0">
     <w:nsid w:val="35AD7583"/>
     <w:multiLevelType w:val="multilevel"/>
     <w:tmpl w:val="0E6A784A"/>
@@ -37530,7 +38451,7 @@
       </w:rPr>
     </w:lvl>
   </w:abstractNum>
-  <w:abstractNum w:abstractNumId="22" w15:restartNumberingAfterBreak="0">
+  <w:abstractNum w:abstractNumId="23" w15:restartNumberingAfterBreak="0">
     <w:nsid w:val="35DC794C"/>
     <w:multiLevelType w:val="hybridMultilevel"/>
     <w:tmpl w:val="6D3ACCC0"/>
@@ -37651,7 +38572,7 @@
       </w:rPr>
     </w:lvl>
   </w:abstractNum>
-  <w:abstractNum w:abstractNumId="23" w15:restartNumberingAfterBreak="0">
+  <w:abstractNum w:abstractNumId="24" w15:restartNumberingAfterBreak="0">
     <w:nsid w:val="363F4BF7"/>
     <w:multiLevelType w:val="hybridMultilevel"/>
     <w:tmpl w:val="79DC6D3A"/>
@@ -37773,7 +38694,7 @@
       </w:rPr>
     </w:lvl>
   </w:abstractNum>
-  <w:abstractNum w:abstractNumId="24" w15:restartNumberingAfterBreak="0">
+  <w:abstractNum w:abstractNumId="25" w15:restartNumberingAfterBreak="0">
     <w:nsid w:val="366F0C40"/>
     <w:multiLevelType w:val="hybridMultilevel"/>
     <w:tmpl w:val="50E0305A"/>
@@ -37903,7 +38824,7 @@
       </w:rPr>
     </w:lvl>
   </w:abstractNum>
-  <w:abstractNum w:abstractNumId="25" w15:restartNumberingAfterBreak="0">
+  <w:abstractNum w:abstractNumId="26" w15:restartNumberingAfterBreak="0">
     <w:nsid w:val="3969224B"/>
     <w:multiLevelType w:val="hybridMultilevel"/>
     <w:tmpl w:val="BF2A43DC"/>
@@ -38024,7 +38945,7 @@
       </w:rPr>
     </w:lvl>
   </w:abstractNum>
-  <w:abstractNum w:abstractNumId="26" w15:restartNumberingAfterBreak="0">
+  <w:abstractNum w:abstractNumId="27" w15:restartNumberingAfterBreak="0">
     <w:nsid w:val="3CDF6476"/>
     <w:multiLevelType w:val="hybridMultilevel"/>
     <w:tmpl w:val="9672FA58"/>
@@ -38137,7 +39058,7 @@
       </w:rPr>
     </w:lvl>
   </w:abstractNum>
-  <w:abstractNum w:abstractNumId="27" w15:restartNumberingAfterBreak="0">
+  <w:abstractNum w:abstractNumId="28" w15:restartNumberingAfterBreak="0">
     <w:nsid w:val="3FA30E0D"/>
     <w:multiLevelType w:val="multilevel"/>
     <w:tmpl w:val="56545A8E"/>
@@ -38286,7 +39207,7 @@
       </w:rPr>
     </w:lvl>
   </w:abstractNum>
-  <w:abstractNum w:abstractNumId="28" w15:restartNumberingAfterBreak="0">
+  <w:abstractNum w:abstractNumId="29" w15:restartNumberingAfterBreak="0">
     <w:nsid w:val="437B073A"/>
     <w:multiLevelType w:val="hybridMultilevel"/>
     <w:tmpl w:val="FF98FA72"/>
@@ -38408,7 +39329,7 @@
       </w:rPr>
     </w:lvl>
   </w:abstractNum>
-  <w:abstractNum w:abstractNumId="29" w15:restartNumberingAfterBreak="0">
+  <w:abstractNum w:abstractNumId="30" w15:restartNumberingAfterBreak="0">
     <w:nsid w:val="46904F50"/>
     <w:multiLevelType w:val="hybridMultilevel"/>
     <w:tmpl w:val="CD0864A4"/>
@@ -38521,7 +39442,7 @@
       </w:rPr>
     </w:lvl>
   </w:abstractNum>
-  <w:abstractNum w:abstractNumId="30" w15:restartNumberingAfterBreak="0">
+  <w:abstractNum w:abstractNumId="31" w15:restartNumberingAfterBreak="0">
     <w:nsid w:val="4AC067F3"/>
     <w:multiLevelType w:val="hybridMultilevel"/>
     <w:tmpl w:val="2DEAB5EC"/>
@@ -38642,7 +39563,7 @@
       </w:rPr>
     </w:lvl>
   </w:abstractNum>
-  <w:abstractNum w:abstractNumId="31" w15:restartNumberingAfterBreak="0">
+  <w:abstractNum w:abstractNumId="32" w15:restartNumberingAfterBreak="0">
     <w:nsid w:val="510F7EC0"/>
     <w:multiLevelType w:val="hybridMultilevel"/>
     <w:tmpl w:val="AF500E0C"/>
@@ -38764,7 +39685,7 @@
       </w:rPr>
     </w:lvl>
   </w:abstractNum>
-  <w:abstractNum w:abstractNumId="32" w15:restartNumberingAfterBreak="0">
+  <w:abstractNum w:abstractNumId="33" w15:restartNumberingAfterBreak="0">
     <w:nsid w:val="5450377B"/>
     <w:multiLevelType w:val="hybridMultilevel"/>
     <w:tmpl w:val="57222640"/>
@@ -38885,7 +39806,7 @@
       </w:rPr>
     </w:lvl>
   </w:abstractNum>
-  <w:abstractNum w:abstractNumId="33" w15:restartNumberingAfterBreak="0">
+  <w:abstractNum w:abstractNumId="34" w15:restartNumberingAfterBreak="0">
     <w:nsid w:val="55351766"/>
     <w:multiLevelType w:val="hybridMultilevel"/>
     <w:tmpl w:val="8DF44754"/>
@@ -39006,7 +39927,7 @@
       </w:rPr>
     </w:lvl>
   </w:abstractNum>
-  <w:abstractNum w:abstractNumId="34" w15:restartNumberingAfterBreak="0">
+  <w:abstractNum w:abstractNumId="35" w15:restartNumberingAfterBreak="0">
     <w:nsid w:val="59AF4CC5"/>
     <w:multiLevelType w:val="hybridMultilevel"/>
     <w:tmpl w:val="EA36C5F8"/>
@@ -39128,7 +40049,7 @@
       </w:rPr>
     </w:lvl>
   </w:abstractNum>
-  <w:abstractNum w:abstractNumId="35" w15:restartNumberingAfterBreak="0">
+  <w:abstractNum w:abstractNumId="36" w15:restartNumberingAfterBreak="0">
     <w:nsid w:val="5A972A9C"/>
     <w:multiLevelType w:val="hybridMultilevel"/>
     <w:tmpl w:val="B6764B50"/>
@@ -39249,7 +40170,7 @@
       </w:rPr>
     </w:lvl>
   </w:abstractNum>
-  <w:abstractNum w:abstractNumId="36" w15:restartNumberingAfterBreak="0">
+  <w:abstractNum w:abstractNumId="37" w15:restartNumberingAfterBreak="0">
     <w:nsid w:val="5E6770AA"/>
     <w:multiLevelType w:val="hybridMultilevel"/>
     <w:tmpl w:val="763A21BE"/>
@@ -39370,7 +40291,7 @@
       </w:rPr>
     </w:lvl>
   </w:abstractNum>
-  <w:abstractNum w:abstractNumId="37" w15:restartNumberingAfterBreak="0">
+  <w:abstractNum w:abstractNumId="38" w15:restartNumberingAfterBreak="0">
     <w:nsid w:val="5EC31ED6"/>
     <w:multiLevelType w:val="hybridMultilevel"/>
     <w:tmpl w:val="50205A00"/>
@@ -39500,7 +40421,7 @@
       </w:rPr>
     </w:lvl>
   </w:abstractNum>
-  <w:abstractNum w:abstractNumId="38" w15:restartNumberingAfterBreak="0">
+  <w:abstractNum w:abstractNumId="39" w15:restartNumberingAfterBreak="0">
     <w:nsid w:val="5FA452EF"/>
     <w:multiLevelType w:val="hybridMultilevel"/>
     <w:tmpl w:val="4CF8477E"/>
@@ -39629,7 +40550,7 @@
       </w:rPr>
     </w:lvl>
   </w:abstractNum>
-  <w:abstractNum w:abstractNumId="39" w15:restartNumberingAfterBreak="0">
+  <w:abstractNum w:abstractNumId="40" w15:restartNumberingAfterBreak="0">
     <w:nsid w:val="60DF0695"/>
     <w:multiLevelType w:val="hybridMultilevel"/>
     <w:tmpl w:val="40E03B44"/>
@@ -39750,7 +40671,7 @@
       </w:rPr>
     </w:lvl>
   </w:abstractNum>
-  <w:abstractNum w:abstractNumId="40" w15:restartNumberingAfterBreak="0">
+  <w:abstractNum w:abstractNumId="41" w15:restartNumberingAfterBreak="0">
     <w:nsid w:val="62576164"/>
     <w:multiLevelType w:val="hybridMultilevel"/>
     <w:tmpl w:val="D8E2DE2E"/>
@@ -39871,7 +40792,7 @@
       </w:rPr>
     </w:lvl>
   </w:abstractNum>
-  <w:abstractNum w:abstractNumId="41" w15:restartNumberingAfterBreak="0">
+  <w:abstractNum w:abstractNumId="42" w15:restartNumberingAfterBreak="0">
     <w:nsid w:val="63D22DF0"/>
     <w:multiLevelType w:val="hybridMultilevel"/>
     <w:tmpl w:val="0E3A22A4"/>
@@ -39993,7 +40914,7 @@
       </w:rPr>
     </w:lvl>
   </w:abstractNum>
-  <w:abstractNum w:abstractNumId="42" w15:restartNumberingAfterBreak="0">
+  <w:abstractNum w:abstractNumId="43" w15:restartNumberingAfterBreak="0">
     <w:nsid w:val="652B617D"/>
     <w:multiLevelType w:val="hybridMultilevel"/>
     <w:tmpl w:val="72F490BE"/>
@@ -40115,7 +41036,7 @@
       </w:rPr>
     </w:lvl>
   </w:abstractNum>
-  <w:abstractNum w:abstractNumId="43" w15:restartNumberingAfterBreak="0">
+  <w:abstractNum w:abstractNumId="44" w15:restartNumberingAfterBreak="0">
     <w:nsid w:val="65621E9D"/>
     <w:multiLevelType w:val="hybridMultilevel"/>
     <w:tmpl w:val="EAFA1636"/>
@@ -40236,7 +41157,7 @@
       </w:rPr>
     </w:lvl>
   </w:abstractNum>
-  <w:abstractNum w:abstractNumId="44" w15:restartNumberingAfterBreak="0">
+  <w:abstractNum w:abstractNumId="45" w15:restartNumberingAfterBreak="0">
     <w:nsid w:val="6AF035C5"/>
     <w:multiLevelType w:val="multilevel"/>
     <w:tmpl w:val="F34AF114"/>
@@ -40388,7 +41309,7 @@
       </w:rPr>
     </w:lvl>
   </w:abstractNum>
-  <w:abstractNum w:abstractNumId="45" w15:restartNumberingAfterBreak="0">
+  <w:abstractNum w:abstractNumId="46" w15:restartNumberingAfterBreak="0">
     <w:nsid w:val="6DE82DE0"/>
     <w:multiLevelType w:val="hybridMultilevel"/>
     <w:tmpl w:val="3D1A58DE"/>
@@ -40509,7 +41430,7 @@
       </w:rPr>
     </w:lvl>
   </w:abstractNum>
-  <w:abstractNum w:abstractNumId="46" w15:restartNumberingAfterBreak="0">
+  <w:abstractNum w:abstractNumId="47" w15:restartNumberingAfterBreak="0">
     <w:nsid w:val="71E53746"/>
     <w:multiLevelType w:val="hybridMultilevel"/>
     <w:tmpl w:val="4E766E48"/>
@@ -40631,7 +41552,7 @@
       </w:rPr>
     </w:lvl>
   </w:abstractNum>
-  <w:abstractNum w:abstractNumId="47" w15:restartNumberingAfterBreak="0">
+  <w:abstractNum w:abstractNumId="48" w15:restartNumberingAfterBreak="0">
     <w:nsid w:val="73D86F68"/>
     <w:multiLevelType w:val="hybridMultilevel"/>
     <w:tmpl w:val="85966416"/>
@@ -40753,7 +41674,7 @@
       </w:rPr>
     </w:lvl>
   </w:abstractNum>
-  <w:abstractNum w:abstractNumId="48" w15:restartNumberingAfterBreak="0">
+  <w:abstractNum w:abstractNumId="49" w15:restartNumberingAfterBreak="0">
     <w:nsid w:val="73F306D8"/>
     <w:multiLevelType w:val="hybridMultilevel"/>
     <w:tmpl w:val="CFDE33A4"/>
@@ -40874,7 +41795,7 @@
       </w:rPr>
     </w:lvl>
   </w:abstractNum>
-  <w:abstractNum w:abstractNumId="49" w15:restartNumberingAfterBreak="0">
+  <w:abstractNum w:abstractNumId="50" w15:restartNumberingAfterBreak="0">
     <w:nsid w:val="77D455AB"/>
     <w:multiLevelType w:val="hybridMultilevel"/>
     <w:tmpl w:val="7E06452E"/>
@@ -40995,7 +41916,7 @@
       </w:rPr>
     </w:lvl>
   </w:abstractNum>
-  <w:abstractNum w:abstractNumId="50" w15:restartNumberingAfterBreak="0">
+  <w:abstractNum w:abstractNumId="51" w15:restartNumberingAfterBreak="0">
     <w:nsid w:val="7AA604E0"/>
     <w:multiLevelType w:val="hybridMultilevel"/>
     <w:tmpl w:val="9D565372"/>
@@ -41124,7 +42045,7 @@
       </w:rPr>
     </w:lvl>
   </w:abstractNum>
-  <w:abstractNum w:abstractNumId="51" w15:restartNumberingAfterBreak="0">
+  <w:abstractNum w:abstractNumId="52" w15:restartNumberingAfterBreak="0">
     <w:nsid w:val="7E3164D4"/>
     <w:multiLevelType w:val="hybridMultilevel"/>
     <w:tmpl w:val="D81E76F4"/>
@@ -41238,73 +42159,73 @@
     </w:lvl>
   </w:abstractNum>
   <w:num w:numId="1" w16cid:durableId="372654535">
-    <w:abstractNumId w:val="17"/>
+    <w:abstractNumId w:val="18"/>
   </w:num>
   <w:num w:numId="2" w16cid:durableId="1623264392">
-    <w:abstractNumId w:val="14"/>
+    <w:abstractNumId w:val="15"/>
   </w:num>
   <w:num w:numId="3" w16cid:durableId="255749827">
-    <w:abstractNumId w:val="38"/>
+    <w:abstractNumId w:val="39"/>
   </w:num>
   <w:num w:numId="4" w16cid:durableId="875041121">
-    <w:abstractNumId w:val="27"/>
+    <w:abstractNumId w:val="28"/>
   </w:num>
   <w:num w:numId="5" w16cid:durableId="1362394769">
-    <w:abstractNumId w:val="33"/>
+    <w:abstractNumId w:val="34"/>
   </w:num>
   <w:num w:numId="6" w16cid:durableId="1851488923">
     <w:abstractNumId w:val="10"/>
   </w:num>
   <w:num w:numId="7" w16cid:durableId="84230131">
-    <w:abstractNumId w:val="47"/>
+    <w:abstractNumId w:val="48"/>
   </w:num>
   <w:num w:numId="8" w16cid:durableId="80681987">
-    <w:abstractNumId w:val="34"/>
+    <w:abstractNumId w:val="35"/>
   </w:num>
   <w:num w:numId="9" w16cid:durableId="1633094255">
-    <w:abstractNumId w:val="37"/>
+    <w:abstractNumId w:val="38"/>
   </w:num>
   <w:num w:numId="10" w16cid:durableId="1693843461">
-    <w:abstractNumId w:val="46"/>
+    <w:abstractNumId w:val="47"/>
   </w:num>
   <w:num w:numId="11" w16cid:durableId="1328946551">
     <w:abstractNumId w:val="6"/>
   </w:num>
   <w:num w:numId="12" w16cid:durableId="833649006">
-    <w:abstractNumId w:val="31"/>
+    <w:abstractNumId w:val="32"/>
   </w:num>
   <w:num w:numId="13" w16cid:durableId="828205911">
-    <w:abstractNumId w:val="24"/>
+    <w:abstractNumId w:val="25"/>
   </w:num>
   <w:num w:numId="14" w16cid:durableId="1482961466">
-    <w:abstractNumId w:val="42"/>
+    <w:abstractNumId w:val="43"/>
   </w:num>
   <w:num w:numId="15" w16cid:durableId="6031404">
-    <w:abstractNumId w:val="18"/>
+    <w:abstractNumId w:val="19"/>
   </w:num>
   <w:num w:numId="16" w16cid:durableId="1748067146">
-    <w:abstractNumId w:val="41"/>
+    <w:abstractNumId w:val="42"/>
   </w:num>
   <w:num w:numId="17" w16cid:durableId="1707635936">
     <w:abstractNumId w:val="9"/>
   </w:num>
   <w:num w:numId="18" w16cid:durableId="2120179133">
-    <w:abstractNumId w:val="40"/>
+    <w:abstractNumId w:val="41"/>
   </w:num>
   <w:num w:numId="19" w16cid:durableId="459766046">
-    <w:abstractNumId w:val="22"/>
+    <w:abstractNumId w:val="23"/>
   </w:num>
   <w:num w:numId="20" w16cid:durableId="1101336759">
-    <w:abstractNumId w:val="43"/>
+    <w:abstractNumId w:val="44"/>
   </w:num>
   <w:num w:numId="21" w16cid:durableId="1462385948">
-    <w:abstractNumId w:val="15"/>
+    <w:abstractNumId w:val="16"/>
   </w:num>
   <w:num w:numId="22" w16cid:durableId="1278413155">
-    <w:abstractNumId w:val="36"/>
+    <w:abstractNumId w:val="37"/>
   </w:num>
   <w:num w:numId="23" w16cid:durableId="1523278693">
-    <w:abstractNumId w:val="32"/>
+    <w:abstractNumId w:val="33"/>
   </w:num>
   <w:num w:numId="24" w16cid:durableId="1619605570">
     <w:abstractNumId w:val="2"/>
@@ -41313,70 +42234,70 @@
     <w:abstractNumId w:val="7"/>
   </w:num>
   <w:num w:numId="26" w16cid:durableId="626399464">
-    <w:abstractNumId w:val="39"/>
+    <w:abstractNumId w:val="40"/>
   </w:num>
   <w:num w:numId="27" w16cid:durableId="731081648">
-    <w:abstractNumId w:val="11"/>
+    <w:abstractNumId w:val="12"/>
   </w:num>
   <w:num w:numId="28" w16cid:durableId="671221302">
     <w:abstractNumId w:val="3"/>
   </w:num>
   <w:num w:numId="29" w16cid:durableId="1108351692">
-    <w:abstractNumId w:val="20"/>
+    <w:abstractNumId w:val="21"/>
   </w:num>
   <w:num w:numId="30" w16cid:durableId="2024503628">
-    <w:abstractNumId w:val="26"/>
+    <w:abstractNumId w:val="27"/>
   </w:num>
   <w:num w:numId="31" w16cid:durableId="1728608761">
     <w:abstractNumId w:val="5"/>
   </w:num>
   <w:num w:numId="32" w16cid:durableId="1449663839">
-    <w:abstractNumId w:val="51"/>
+    <w:abstractNumId w:val="52"/>
   </w:num>
   <w:num w:numId="33" w16cid:durableId="2014258105">
-    <w:abstractNumId w:val="12"/>
+    <w:abstractNumId w:val="13"/>
   </w:num>
   <w:num w:numId="34" w16cid:durableId="695816201">
-    <w:abstractNumId w:val="13"/>
+    <w:abstractNumId w:val="14"/>
   </w:num>
   <w:num w:numId="35" w16cid:durableId="1630283966">
-    <w:abstractNumId w:val="29"/>
+    <w:abstractNumId w:val="30"/>
   </w:num>
   <w:num w:numId="36" w16cid:durableId="1049037530">
-    <w:abstractNumId w:val="15"/>
+    <w:abstractNumId w:val="16"/>
     <w:lvlOverride w:ilvl="0">
       <w:startOverride w:val="2"/>
     </w:lvlOverride>
   </w:num>
   <w:num w:numId="37" w16cid:durableId="520243065">
-    <w:abstractNumId w:val="21"/>
+    <w:abstractNumId w:val="22"/>
   </w:num>
   <w:num w:numId="38" w16cid:durableId="117341103">
-    <w:abstractNumId w:val="19"/>
+    <w:abstractNumId w:val="20"/>
   </w:num>
   <w:num w:numId="39" w16cid:durableId="282925786">
-    <w:abstractNumId w:val="44"/>
+    <w:abstractNumId w:val="45"/>
   </w:num>
   <w:num w:numId="40" w16cid:durableId="436874247">
-    <w:abstractNumId w:val="23"/>
+    <w:abstractNumId w:val="24"/>
   </w:num>
   <w:num w:numId="41" w16cid:durableId="1667900698">
-    <w:abstractNumId w:val="35"/>
+    <w:abstractNumId w:val="36"/>
   </w:num>
   <w:num w:numId="42" w16cid:durableId="1799836810">
     <w:abstractNumId w:val="0"/>
   </w:num>
   <w:num w:numId="43" w16cid:durableId="1613171892">
-    <w:abstractNumId w:val="28"/>
+    <w:abstractNumId w:val="29"/>
   </w:num>
   <w:num w:numId="44" w16cid:durableId="2049060617">
-    <w:abstractNumId w:val="25"/>
+    <w:abstractNumId w:val="26"/>
   </w:num>
   <w:num w:numId="45" w16cid:durableId="81608683">
-    <w:abstractNumId w:val="30"/>
+    <w:abstractNumId w:val="31"/>
   </w:num>
   <w:num w:numId="46" w16cid:durableId="832448190">
-    <w:abstractNumId w:val="49"/>
+    <w:abstractNumId w:val="50"/>
   </w:num>
   <w:num w:numId="47" w16cid:durableId="1979874302">
     <w:abstractNumId w:val="4"/>
@@ -41385,19 +42306,22 @@
     <w:abstractNumId w:val="1"/>
   </w:num>
   <w:num w:numId="49" w16cid:durableId="2146897147">
-    <w:abstractNumId w:val="16"/>
+    <w:abstractNumId w:val="17"/>
   </w:num>
   <w:num w:numId="50" w16cid:durableId="1318875866">
-    <w:abstractNumId w:val="48"/>
+    <w:abstractNumId w:val="49"/>
   </w:num>
   <w:num w:numId="51" w16cid:durableId="488862159">
-    <w:abstractNumId w:val="45"/>
+    <w:abstractNumId w:val="46"/>
   </w:num>
   <w:num w:numId="52" w16cid:durableId="930510097">
-    <w:abstractNumId w:val="50"/>
+    <w:abstractNumId w:val="51"/>
   </w:num>
   <w:num w:numId="53" w16cid:durableId="956064341">
     <w:abstractNumId w:val="8"/>
+  </w:num>
+  <w:num w:numId="54" w16cid:durableId="68694092">
+    <w:abstractNumId w:val="11"/>
   </w:num>
 </w:numbering>
 </file>
@@ -42048,7 +42972,6 @@
   <w:style w:type="character" w:default="1" w:styleId="Fuentedeprrafopredeter">
     <w:name w:val="Default Paragraph Font"/>
     <w:uiPriority w:val="1"/>
-    <w:semiHidden/>
     <w:unhideWhenUsed/>
   </w:style>
   <w:style w:type="table" w:default="1" w:styleId="Tablanormal">
@@ -42844,6 +43767,34 @@
     <w:rPr>
       <w:smallCaps/>
       <w:color w:val="5A5A5A" w:themeColor="text1" w:themeTint="A5"/>
+    </w:rPr>
+  </w:style>
+  <w:style w:type="character" w:styleId="Textoennegrita">
+    <w:name w:val="Strong"/>
+    <w:basedOn w:val="Fuentedeprrafopredeter"/>
+    <w:uiPriority w:val="22"/>
+    <w:qFormat/>
+    <w:rsid w:val="007627E0"/>
+    <w:rPr>
+      <w:b/>
+      <w:bCs/>
+    </w:rPr>
+  </w:style>
+  <w:style w:type="paragraph" w:customStyle="1" w:styleId="isselectedend">
+    <w:name w:val="isselectedend"/>
+    <w:basedOn w:val="Normal"/>
+    <w:rsid w:val="00ED10BF"/>
+    <w:pPr>
+      <w:widowControl/>
+      <w:autoSpaceDE/>
+      <w:autoSpaceDN/>
+      <w:spacing w:before="100" w:beforeAutospacing="1" w:after="100" w:afterAutospacing="1" w:line="240" w:lineRule="auto"/>
+      <w:ind w:firstLine="0"/>
+      <w:jc w:val="left"/>
+    </w:pPr>
+    <w:rPr>
+      <w:szCs w:val="24"/>
+      <w:lang w:val="es-CO" w:eastAsia="es-CO"/>
     </w:rPr>
   </w:style>
 </w:styles>

</xml_diff>